<commit_message>
feat(ingestion): integrate Docling visual enrichment and test documents
</commit_message>
<xml_diff>
--- a/input/DOC-001.docx
+++ b/input/DOC-001.docx
@@ -9,53 +9,78 @@
       <w:r>
         <w:rPr>
           <w:b/>
-          <w:sz w:val="38"/>
+          <w:sz w:val="40"/>
         </w:rPr>
-        <w:t>PROJECT OVERVIEW — KNOWLEDGE ASSISTANT</w:t>
+        <w:t>EMPLOYEE HANDBOOK — TEST DOCUMENT</w:t>
       </w:r>
     </w:p>
     <w:p>
+      <w:pPr>
+        <w:jc w:val="center"/>
+      </w:pPr>
       <w:r>
         <w:rPr>
           <w:b/>
+          <w:sz w:val="24"/>
         </w:rPr>
-        <w:t xml:space="preserve">Project Goal: </w:t>
-      </w:r>
-      <w:r>
-        <w:t>Build an internal knowledge assistant that allows authorized employees to ask questions about company and project documents and receive evidence-backed answers.</w:t>
+        <w:t>Nexora Technologies | Internal Use</w:t>
       </w:r>
     </w:p>
     <w:p>
+      <w:pPr>
+        <w:spacing w:after="60"/>
+      </w:pPr>
       <w:r>
         <w:rPr>
           <w:b/>
+          <w:sz w:val="20"/>
         </w:rPr>
-        <w:t xml:space="preserve">Problem Statement: </w:t>
+        <w:t xml:space="preserve">Purpose: </w:t>
       </w:r>
       <w:r>
-        <w:t>Important organizational knowledge is distributed across employee handbooks, project documents, technical material, and other files. Employees need a controlled way to find relevant information without exposing documents they are not authorized to access.</w:t>
+        <w:t>This test handbook contains one page of searchable text followed by image-based policy pages. The image pages intentionally contain the detailed policy information so document extraction, OCR, layout understanding, and image-text retrieval can be tested.</w:t>
       </w:r>
     </w:p>
     <w:p>
+      <w:pPr>
+        <w:spacing w:after="60"/>
+      </w:pPr>
       <w:r>
         <w:rPr>
           <w:b/>
+          <w:sz w:val="20"/>
         </w:rPr>
-        <w:t xml:space="preserve">Core Approach: </w:t>
+        <w:t xml:space="preserve">How to Use This Test: </w:t>
       </w:r>
       <w:r>
-        <w:t>The system uses retrieval-augmented generation (RAG): documents are ingested into a searchable knowledge store, relevant evidence is retrieved for a user question, and the answer is generated using the selected evidence.</w:t>
+        <w:t>The detailed information is embedded inside the images. Test questions should therefore cover both the one-page text and information visible only inside images. Example questions include: How many annual leave days are provided? What are the standard working hours? What should an employee do after receiving a suspicious email?</w:t>
       </w:r>
     </w:p>
     <w:p>
+      <w:pPr>
+        <w:spacing w:after="60"/>
+      </w:pPr>
       <w:r>
         <w:rPr>
           <w:b/>
+          <w:sz w:val="20"/>
         </w:rPr>
-        <w:t xml:space="preserve">Success Criteria: </w:t>
+        <w:t xml:space="preserve">Important: </w:t>
       </w:r>
       <w:r>
-        <w:t>Answers should be grounded in available documents, include useful citations, respect user authorization, reject questions outside the available knowledge, and remain maintainable as document and user counts grow.</w:t>
+        <w:t>This document is synthetic test data created for document-ingestion testing. It is not an official company policy. Where this document conflicts with an actual employee handbook, the actual approved policy takes precedence.</w:t>
+      </w:r>
+    </w:p>
+    <w:p>
+      <w:pPr>
+        <w:jc w:val="center"/>
+      </w:pPr>
+      <w:r>
+        <w:rPr>
+          <w:i/>
+          <w:sz w:val="18"/>
+        </w:rPr>
+        <w:t>End of text section — detailed policy content is contained in the following images.</w:t>
       </w:r>
     </w:p>
     <w:p>
@@ -79,7 +104,7 @@
               <a:graphicData uri="http://schemas.openxmlformats.org/drawingml/2006/picture">
                 <pic:pic>
                   <pic:nvPicPr>
-                    <pic:cNvPr id="0" name="project_architecture.png"/>
+                    <pic:cNvPr id="0" name="leave_policy.png"/>
                     <pic:cNvPicPr/>
                   </pic:nvPicPr>
                   <pic:blipFill>
@@ -123,11 +148,99 @@
               <a:graphicData uri="http://schemas.openxmlformats.org/drawingml/2006/picture">
                 <pic:pic>
                   <pic:nvPicPr>
-                    <pic:cNvPr id="0" name="project_milestones.png"/>
+                    <pic:cNvPr id="0" name="code_of_conduct.png"/>
                     <pic:cNvPicPr/>
                   </pic:nvPicPr>
                   <pic:blipFill>
                     <a:blip r:embed="rId10"/>
+                    <a:stretch>
+                      <a:fillRect/>
+                    </a:stretch>
+                  </pic:blipFill>
+                  <pic:spPr>
+                    <a:xfrm>
+                      <a:off x="0" y="0"/>
+                      <a:ext cx="6309360" cy="3830683"/>
+                    </a:xfrm>
+                    <a:prstGeom prst="rect"/>
+                  </pic:spPr>
+                </pic:pic>
+              </a:graphicData>
+            </a:graphic>
+          </wp:inline>
+        </w:drawing>
+      </w:r>
+    </w:p>
+    <w:p>
+      <w:r>
+        <w:br w:type="page"/>
+      </w:r>
+    </w:p>
+    <w:p>
+      <w:pPr>
+        <w:jc w:val="center"/>
+      </w:pPr>
+      <w:r>
+        <w:drawing>
+          <wp:inline xmlns:a="http://schemas.openxmlformats.org/drawingml/2006/main" xmlns:pic="http://schemas.openxmlformats.org/drawingml/2006/picture">
+            <wp:extent cx="6309360" cy="3830683"/>
+            <wp:docPr id="3" name="Picture 3"/>
+            <wp:cNvGraphicFramePr>
+              <a:graphicFrameLocks noChangeAspect="1"/>
+            </wp:cNvGraphicFramePr>
+            <a:graphic>
+              <a:graphicData uri="http://schemas.openxmlformats.org/drawingml/2006/picture">
+                <pic:pic>
+                  <pic:nvPicPr>
+                    <pic:cNvPr id="0" name="information_security.png"/>
+                    <pic:cNvPicPr/>
+                  </pic:nvPicPr>
+                  <pic:blipFill>
+                    <a:blip r:embed="rId11"/>
+                    <a:stretch>
+                      <a:fillRect/>
+                    </a:stretch>
+                  </pic:blipFill>
+                  <pic:spPr>
+                    <a:xfrm>
+                      <a:off x="0" y="0"/>
+                      <a:ext cx="6309360" cy="3830683"/>
+                    </a:xfrm>
+                    <a:prstGeom prst="rect"/>
+                  </pic:spPr>
+                </pic:pic>
+              </a:graphicData>
+            </a:graphic>
+          </wp:inline>
+        </w:drawing>
+      </w:r>
+    </w:p>
+    <w:p>
+      <w:r>
+        <w:br w:type="page"/>
+      </w:r>
+    </w:p>
+    <w:p>
+      <w:pPr>
+        <w:jc w:val="center"/>
+      </w:pPr>
+      <w:r>
+        <w:drawing>
+          <wp:inline xmlns:a="http://schemas.openxmlformats.org/drawingml/2006/main" xmlns:pic="http://schemas.openxmlformats.org/drawingml/2006/picture">
+            <wp:extent cx="6309360" cy="3830683"/>
+            <wp:docPr id="4" name="Picture 4"/>
+            <wp:cNvGraphicFramePr>
+              <a:graphicFrameLocks noChangeAspect="1"/>
+            </wp:cNvGraphicFramePr>
+            <a:graphic>
+              <a:graphicData uri="http://schemas.openxmlformats.org/drawingml/2006/picture">
+                <pic:pic>
+                  <pic:nvPicPr>
+                    <pic:cNvPr id="0" name="remote_work.png"/>
+                    <pic:cNvPicPr/>
+                  </pic:nvPicPr>
+                  <pic:blipFill>
+                    <a:blip r:embed="rId12"/>
                     <a:stretch>
                       <a:fillRect/>
                     </a:stretch>

</xml_diff>

<commit_message>
chore: add reset db code
</commit_message>
<xml_diff>
--- a/input/DOC-001.docx
+++ b/input/DOC-001.docx
@@ -9,66 +9,9 @@
       <w:r>
         <w:rPr>
           <w:b/>
-          <w:sz w:val="40"/>
+          <w:sz w:val="42"/>
         </w:rPr>
-        <w:t>EMPLOYEE HANDBOOK — TEST DOCUMENT</w:t>
-      </w:r>
-    </w:p>
-    <w:p>
-      <w:pPr>
-        <w:jc w:val="center"/>
-      </w:pPr>
-      <w:r>
-        <w:rPr>
-          <w:b/>
-          <w:sz w:val="24"/>
-        </w:rPr>
-        <w:t>Nexora Technologies | Internal Use</w:t>
-      </w:r>
-    </w:p>
-    <w:p>
-      <w:pPr>
-        <w:spacing w:after="60"/>
-      </w:pPr>
-      <w:r>
-        <w:rPr>
-          <w:b/>
-          <w:sz w:val="20"/>
-        </w:rPr>
-        <w:t xml:space="preserve">Purpose: </w:t>
-      </w:r>
-      <w:r>
-        <w:t>This test handbook contains one page of searchable text followed by image-based policy pages. The image pages intentionally contain the detailed policy information so document extraction, OCR, layout understanding, and image-text retrieval can be tested.</w:t>
-      </w:r>
-    </w:p>
-    <w:p>
-      <w:pPr>
-        <w:spacing w:after="60"/>
-      </w:pPr>
-      <w:r>
-        <w:rPr>
-          <w:b/>
-          <w:sz w:val="20"/>
-        </w:rPr>
-        <w:t xml:space="preserve">How to Use This Test: </w:t>
-      </w:r>
-      <w:r>
-        <w:t>The detailed information is embedded inside the images. Test questions should therefore cover both the one-page text and information visible only inside images. Example questions include: How many annual leave days are provided? What are the standard working hours? What should an employee do after receiving a suspicious email?</w:t>
-      </w:r>
-    </w:p>
-    <w:p>
-      <w:pPr>
-        <w:spacing w:after="60"/>
-      </w:pPr>
-      <w:r>
-        <w:rPr>
-          <w:b/>
-          <w:sz w:val="20"/>
-        </w:rPr>
-        <w:t xml:space="preserve">Important: </w:t>
-      </w:r>
-      <w:r>
-        <w:t>This document is synthetic test data created for document-ingestion testing. It is not an official company policy. Where this document conflicts with an actual employee handbook, the actual approved policy takes precedence.</w:t>
+        <w:t>Employee Onboarding Guide</w:t>
       </w:r>
     </w:p>
     <w:p>
@@ -78,9 +21,280 @@
       <w:r>
         <w:rPr>
           <w:i/>
-          <w:sz w:val="18"/>
+          <w:sz w:val="22"/>
         </w:rPr>
-        <w:t>End of text section — detailed policy content is contained in the following images.</w:t>
+        <w:t>A practical reference for new team members</w:t>
+      </w:r>
+    </w:p>
+    <w:p>
+      <w:pPr>
+        <w:pStyle w:val="Heading1"/>
+      </w:pPr>
+      <w:r>
+        <w:t>1. Welcome to the Organization</w:t>
+      </w:r>
+    </w:p>
+    <w:p>
+      <w:r>
+        <w:t>Starting a new role involves learning the organization, understanding responsibilities, meeting colleagues, and becoming familiar with the tools used every day. This guide provides a simple reference that a new employee can use during the first few weeks.</w:t>
+      </w:r>
+    </w:p>
+    <w:p>
+      <w:pPr>
+        <w:pStyle w:val="Heading1"/>
+      </w:pPr>
+      <w:r>
+        <w:t>2. First-Week Objectives</w:t>
+      </w:r>
+    </w:p>
+    <w:p>
+      <w:r>
+        <w:t>During the first week, the employee should focus on understanding the team's purpose, completing required access requests, reviewing important documentation, and identifying the people who can provide help when questions arise.</w:t>
+      </w:r>
+    </w:p>
+    <w:tbl>
+      <w:tblPr>
+        <w:tblStyle w:val="TableGrid"/>
+        <w:tblW w:type="auto" w:w="0"/>
+        <w:jc w:val="center"/>
+        <w:tblLook w:firstColumn="1" w:firstRow="1" w:lastColumn="0" w:lastRow="0" w:noHBand="0" w:noVBand="1" w:val="04A0"/>
+      </w:tblPr>
+      <w:tblGrid>
+        <w:gridCol w:w="3360"/>
+        <w:gridCol w:w="3360"/>
+        <w:gridCol w:w="3360"/>
+      </w:tblGrid>
+      <w:tr>
+        <w:tc>
+          <w:tcPr>
+            <w:tcW w:type="dxa" w:w="3360"/>
+            <w:vAlign w:val="center"/>
+          </w:tcPr>
+          <w:p>
+            <w:r>
+              <w:rPr>
+                <w:b/>
+              </w:rPr>
+              <w:t>Activity</w:t>
+            </w:r>
+          </w:p>
+        </w:tc>
+        <w:tc>
+          <w:tcPr>
+            <w:tcW w:type="dxa" w:w="3360"/>
+            <w:vAlign w:val="center"/>
+          </w:tcPr>
+          <w:p>
+            <w:r>
+              <w:rPr>
+                <w:b/>
+              </w:rPr>
+              <w:t>Expected Outcome</w:t>
+            </w:r>
+          </w:p>
+        </w:tc>
+        <w:tc>
+          <w:tcPr>
+            <w:tcW w:type="dxa" w:w="3360"/>
+            <w:vAlign w:val="center"/>
+          </w:tcPr>
+          <w:p>
+            <w:r>
+              <w:rPr>
+                <w:b/>
+              </w:rPr>
+              <w:t>Suggested Timing</w:t>
+            </w:r>
+          </w:p>
+        </w:tc>
+      </w:tr>
+      <w:tr>
+        <w:tc>
+          <w:tcPr>
+            <w:tcW w:type="dxa" w:w="3360"/>
+            <w:vAlign w:val="center"/>
+          </w:tcPr>
+          <w:p>
+            <w:r>
+              <w:t>Complete introduction</w:t>
+            </w:r>
+          </w:p>
+        </w:tc>
+        <w:tc>
+          <w:tcPr>
+            <w:tcW w:type="dxa" w:w="3360"/>
+            <w:vAlign w:val="center"/>
+          </w:tcPr>
+          <w:p>
+            <w:r>
+              <w:t>Meet manager and immediate team</w:t>
+            </w:r>
+          </w:p>
+        </w:tc>
+        <w:tc>
+          <w:tcPr>
+            <w:tcW w:type="dxa" w:w="3360"/>
+            <w:vAlign w:val="center"/>
+          </w:tcPr>
+          <w:p>
+            <w:r>
+              <w:t>Day 1</w:t>
+            </w:r>
+          </w:p>
+        </w:tc>
+      </w:tr>
+      <w:tr>
+        <w:tc>
+          <w:tcPr>
+            <w:tcW w:type="dxa" w:w="3360"/>
+            <w:vAlign w:val="center"/>
+          </w:tcPr>
+          <w:p>
+            <w:r>
+              <w:t>Set up accounts</w:t>
+            </w:r>
+          </w:p>
+        </w:tc>
+        <w:tc>
+          <w:tcPr>
+            <w:tcW w:type="dxa" w:w="3360"/>
+            <w:vAlign w:val="center"/>
+          </w:tcPr>
+          <w:p>
+            <w:r>
+              <w:t>Required systems are accessible</w:t>
+            </w:r>
+          </w:p>
+        </w:tc>
+        <w:tc>
+          <w:tcPr>
+            <w:tcW w:type="dxa" w:w="3360"/>
+            <w:vAlign w:val="center"/>
+          </w:tcPr>
+          <w:p>
+            <w:r>
+              <w:t>Day 1–2</w:t>
+            </w:r>
+          </w:p>
+        </w:tc>
+      </w:tr>
+      <w:tr>
+        <w:tc>
+          <w:tcPr>
+            <w:tcW w:type="dxa" w:w="3360"/>
+            <w:vAlign w:val="center"/>
+          </w:tcPr>
+          <w:p>
+            <w:r>
+              <w:t>Review documentation</w:t>
+            </w:r>
+          </w:p>
+        </w:tc>
+        <w:tc>
+          <w:tcPr>
+            <w:tcW w:type="dxa" w:w="3360"/>
+            <w:vAlign w:val="center"/>
+          </w:tcPr>
+          <w:p>
+            <w:r>
+              <w:t>Understand basic policies and processes</w:t>
+            </w:r>
+          </w:p>
+        </w:tc>
+        <w:tc>
+          <w:tcPr>
+            <w:tcW w:type="dxa" w:w="3360"/>
+            <w:vAlign w:val="center"/>
+          </w:tcPr>
+          <w:p>
+            <w:r>
+              <w:t>Day 2–3</w:t>
+            </w:r>
+          </w:p>
+        </w:tc>
+      </w:tr>
+      <w:tr>
+        <w:tc>
+          <w:tcPr>
+            <w:tcW w:type="dxa" w:w="3360"/>
+            <w:vAlign w:val="center"/>
+          </w:tcPr>
+          <w:p>
+            <w:r>
+              <w:t>Attend team meeting</w:t>
+            </w:r>
+          </w:p>
+        </w:tc>
+        <w:tc>
+          <w:tcPr>
+            <w:tcW w:type="dxa" w:w="3360"/>
+            <w:vAlign w:val="center"/>
+          </w:tcPr>
+          <w:p>
+            <w:r>
+              <w:t>Understand current priorities</w:t>
+            </w:r>
+          </w:p>
+        </w:tc>
+        <w:tc>
+          <w:tcPr>
+            <w:tcW w:type="dxa" w:w="3360"/>
+            <w:vAlign w:val="center"/>
+          </w:tcPr>
+          <w:p>
+            <w:r>
+              <w:t>Day 2–5</w:t>
+            </w:r>
+          </w:p>
+        </w:tc>
+      </w:tr>
+      <w:tr>
+        <w:tc>
+          <w:tcPr>
+            <w:tcW w:type="dxa" w:w="3360"/>
+            <w:vAlign w:val="center"/>
+          </w:tcPr>
+          <w:p>
+            <w:r>
+              <w:t>Confirm responsibilities</w:t>
+            </w:r>
+          </w:p>
+        </w:tc>
+        <w:tc>
+          <w:tcPr>
+            <w:tcW w:type="dxa" w:w="3360"/>
+            <w:vAlign w:val="center"/>
+          </w:tcPr>
+          <w:p>
+            <w:r>
+              <w:t>Know initial tasks and expectations</w:t>
+            </w:r>
+          </w:p>
+        </w:tc>
+        <w:tc>
+          <w:tcPr>
+            <w:tcW w:type="dxa" w:w="3360"/>
+            <w:vAlign w:val="center"/>
+          </w:tcPr>
+          <w:p>
+            <w:r>
+              <w:t>By Day 5</w:t>
+            </w:r>
+          </w:p>
+        </w:tc>
+      </w:tr>
+    </w:tbl>
+    <w:p>
+      <w:pPr>
+        <w:pStyle w:val="Heading1"/>
+      </w:pPr>
+      <w:r>
+        <w:t>3. Important Working Principles</w:t>
+      </w:r>
+    </w:p>
+    <w:p>
+      <w:r>
+        <w:t>Employees are expected to communicate clearly, protect company information, follow established processes, ask questions when requirements are unclear, and document important decisions. Good documentation reduces repeated work and helps other team members understand the context behind a task.</w:t>
       </w:r>
     </w:p>
     <w:p>
@@ -93,38 +307,522 @@
         <w:jc w:val="center"/>
       </w:pPr>
       <w:r>
-        <w:drawing>
-          <wp:inline xmlns:a="http://schemas.openxmlformats.org/drawingml/2006/main" xmlns:pic="http://schemas.openxmlformats.org/drawingml/2006/picture">
-            <wp:extent cx="6309360" cy="3830683"/>
-            <wp:docPr id="1" name="Picture 1"/>
-            <wp:cNvGraphicFramePr>
-              <a:graphicFrameLocks noChangeAspect="1"/>
-            </wp:cNvGraphicFramePr>
-            <a:graphic>
-              <a:graphicData uri="http://schemas.openxmlformats.org/drawingml/2006/picture">
-                <pic:pic>
-                  <pic:nvPicPr>
-                    <pic:cNvPr id="0" name="leave_policy.png"/>
-                    <pic:cNvPicPr/>
-                  </pic:nvPicPr>
-                  <pic:blipFill>
-                    <a:blip r:embed="rId9"/>
-                    <a:stretch>
-                      <a:fillRect/>
-                    </a:stretch>
-                  </pic:blipFill>
-                  <pic:spPr>
-                    <a:xfrm>
-                      <a:off x="0" y="0"/>
-                      <a:ext cx="6309360" cy="3830683"/>
-                    </a:xfrm>
-                    <a:prstGeom prst="rect"/>
-                  </pic:spPr>
-                </pic:pic>
-              </a:graphicData>
-            </a:graphic>
-          </wp:inline>
-        </w:drawing>
+        <w:rPr>
+          <w:b/>
+          <w:sz w:val="42"/>
+        </w:rPr>
+        <w:t>Project Operations Reference</w:t>
+      </w:r>
+    </w:p>
+    <w:p>
+      <w:pPr>
+        <w:pStyle w:val="Heading1"/>
+      </w:pPr>
+      <w:r>
+        <w:t>4. Understanding a Project</w:t>
+      </w:r>
+    </w:p>
+    <w:p>
+      <w:r>
+        <w:t>A project is a coordinated set of activities intended to produce a defined outcome. Projects normally have objectives, stakeholders, timelines, deliverables, dependencies, and acceptance criteria. Understanding these elements helps an employee connect individual tasks with the broader project goal.</w:t>
+      </w:r>
+    </w:p>
+    <w:p>
+      <w:pPr>
+        <w:pStyle w:val="Heading1"/>
+      </w:pPr>
+      <w:r>
+        <w:t>5. Project Roles and Responsibilities</w:t>
+      </w:r>
+    </w:p>
+    <w:tbl>
+      <w:tblPr>
+        <w:tblStyle w:val="TableGrid"/>
+        <w:tblW w:type="auto" w:w="0"/>
+        <w:jc w:val="center"/>
+        <w:tblLook w:firstColumn="1" w:firstRow="1" w:lastColumn="0" w:lastRow="0" w:noHBand="0" w:noVBand="1" w:val="04A0"/>
+      </w:tblPr>
+      <w:tblGrid>
+        <w:gridCol w:w="3360"/>
+        <w:gridCol w:w="3360"/>
+        <w:gridCol w:w="3360"/>
+      </w:tblGrid>
+      <w:tr>
+        <w:tc>
+          <w:tcPr>
+            <w:tcW w:type="dxa" w:w="3360"/>
+            <w:vAlign w:val="center"/>
+          </w:tcPr>
+          <w:p>
+            <w:r>
+              <w:rPr>
+                <w:b/>
+              </w:rPr>
+              <w:t>Role</w:t>
+            </w:r>
+          </w:p>
+        </w:tc>
+        <w:tc>
+          <w:tcPr>
+            <w:tcW w:type="dxa" w:w="3360"/>
+            <w:vAlign w:val="center"/>
+          </w:tcPr>
+          <w:p>
+            <w:r>
+              <w:rPr>
+                <w:b/>
+              </w:rPr>
+              <w:t>Primary Responsibility</w:t>
+            </w:r>
+          </w:p>
+        </w:tc>
+        <w:tc>
+          <w:tcPr>
+            <w:tcW w:type="dxa" w:w="3360"/>
+            <w:vAlign w:val="center"/>
+          </w:tcPr>
+          <w:p>
+            <w:r>
+              <w:rPr>
+                <w:b/>
+              </w:rPr>
+              <w:t>Typical Interaction</w:t>
+            </w:r>
+          </w:p>
+        </w:tc>
+      </w:tr>
+      <w:tr>
+        <w:tc>
+          <w:tcPr>
+            <w:tcW w:type="dxa" w:w="3360"/>
+            <w:vAlign w:val="center"/>
+          </w:tcPr>
+          <w:p>
+            <w:r>
+              <w:t>Project Manager</w:t>
+            </w:r>
+          </w:p>
+        </w:tc>
+        <w:tc>
+          <w:tcPr>
+            <w:tcW w:type="dxa" w:w="3360"/>
+            <w:vAlign w:val="center"/>
+          </w:tcPr>
+          <w:p>
+            <w:r>
+              <w:t>Planning, coordination, status tracking</w:t>
+            </w:r>
+          </w:p>
+        </w:tc>
+        <w:tc>
+          <w:tcPr>
+            <w:tcW w:type="dxa" w:w="3360"/>
+            <w:vAlign w:val="center"/>
+          </w:tcPr>
+          <w:p>
+            <w:r>
+              <w:t>Team and stakeholders</w:t>
+            </w:r>
+          </w:p>
+        </w:tc>
+      </w:tr>
+      <w:tr>
+        <w:tc>
+          <w:tcPr>
+            <w:tcW w:type="dxa" w:w="3360"/>
+            <w:vAlign w:val="center"/>
+          </w:tcPr>
+          <w:p>
+            <w:r>
+              <w:t>Technical Lead</w:t>
+            </w:r>
+          </w:p>
+        </w:tc>
+        <w:tc>
+          <w:tcPr>
+            <w:tcW w:type="dxa" w:w="3360"/>
+            <w:vAlign w:val="center"/>
+          </w:tcPr>
+          <w:p>
+            <w:r>
+              <w:t>Technical direction and design decisions</w:t>
+            </w:r>
+          </w:p>
+        </w:tc>
+        <w:tc>
+          <w:tcPr>
+            <w:tcW w:type="dxa" w:w="3360"/>
+            <w:vAlign w:val="center"/>
+          </w:tcPr>
+          <w:p>
+            <w:r>
+              <w:t>Developers and architects</w:t>
+            </w:r>
+          </w:p>
+        </w:tc>
+      </w:tr>
+      <w:tr>
+        <w:tc>
+          <w:tcPr>
+            <w:tcW w:type="dxa" w:w="3360"/>
+            <w:vAlign w:val="center"/>
+          </w:tcPr>
+          <w:p>
+            <w:r>
+              <w:t>Developer</w:t>
+            </w:r>
+          </w:p>
+        </w:tc>
+        <w:tc>
+          <w:tcPr>
+            <w:tcW w:type="dxa" w:w="3360"/>
+            <w:vAlign w:val="center"/>
+          </w:tcPr>
+          <w:p>
+            <w:r>
+              <w:t>Implementation and technical changes</w:t>
+            </w:r>
+          </w:p>
+        </w:tc>
+        <w:tc>
+          <w:tcPr>
+            <w:tcW w:type="dxa" w:w="3360"/>
+            <w:vAlign w:val="center"/>
+          </w:tcPr>
+          <w:p>
+            <w:r>
+              <w:t>Technical team</w:t>
+            </w:r>
+          </w:p>
+        </w:tc>
+      </w:tr>
+      <w:tr>
+        <w:tc>
+          <w:tcPr>
+            <w:tcW w:type="dxa" w:w="3360"/>
+            <w:vAlign w:val="center"/>
+          </w:tcPr>
+          <w:p>
+            <w:r>
+              <w:t>QA / Tester</w:t>
+            </w:r>
+          </w:p>
+        </w:tc>
+        <w:tc>
+          <w:tcPr>
+            <w:tcW w:type="dxa" w:w="3360"/>
+            <w:vAlign w:val="center"/>
+          </w:tcPr>
+          <w:p>
+            <w:r>
+              <w:t>Validation and defect reporting</w:t>
+            </w:r>
+          </w:p>
+        </w:tc>
+        <w:tc>
+          <w:tcPr>
+            <w:tcW w:type="dxa" w:w="3360"/>
+            <w:vAlign w:val="center"/>
+          </w:tcPr>
+          <w:p>
+            <w:r>
+              <w:t>Developers and project team</w:t>
+            </w:r>
+          </w:p>
+        </w:tc>
+      </w:tr>
+      <w:tr>
+        <w:tc>
+          <w:tcPr>
+            <w:tcW w:type="dxa" w:w="3360"/>
+            <w:vAlign w:val="center"/>
+          </w:tcPr>
+          <w:p>
+            <w:r>
+              <w:t>Business Stakeholder</w:t>
+            </w:r>
+          </w:p>
+        </w:tc>
+        <w:tc>
+          <w:tcPr>
+            <w:tcW w:type="dxa" w:w="3360"/>
+            <w:vAlign w:val="center"/>
+          </w:tcPr>
+          <w:p>
+            <w:r>
+              <w:t>Requirements and business expectations</w:t>
+            </w:r>
+          </w:p>
+        </w:tc>
+        <w:tc>
+          <w:tcPr>
+            <w:tcW w:type="dxa" w:w="3360"/>
+            <w:vAlign w:val="center"/>
+          </w:tcPr>
+          <w:p>
+            <w:r>
+              <w:t>Project leadership</w:t>
+            </w:r>
+          </w:p>
+        </w:tc>
+      </w:tr>
+    </w:tbl>
+    <w:p>
+      <w:pPr>
+        <w:pStyle w:val="Heading1"/>
+      </w:pPr>
+      <w:r>
+        <w:t>6. Task Lifecycle</w:t>
+      </w:r>
+    </w:p>
+    <w:p>
+      <w:r>
+        <w:t>A task generally begins with a clear requirement. The owner then investigates the requirement, plans the implementation, performs the work, validates the result, and records the outcome. If a dependency or blocker appears, it should be communicated early rather than discovered near the deadline.</w:t>
+      </w:r>
+    </w:p>
+    <w:tbl>
+      <w:tblPr>
+        <w:tblStyle w:val="TableGrid"/>
+        <w:tblW w:type="auto" w:w="0"/>
+        <w:jc w:val="center"/>
+        <w:tblLook w:firstColumn="1" w:firstRow="1" w:lastColumn="0" w:lastRow="0" w:noHBand="0" w:noVBand="1" w:val="04A0"/>
+      </w:tblPr>
+      <w:tblGrid>
+        <w:gridCol w:w="3360"/>
+        <w:gridCol w:w="3360"/>
+        <w:gridCol w:w="3360"/>
+      </w:tblGrid>
+      <w:tr>
+        <w:tc>
+          <w:tcPr>
+            <w:tcW w:type="dxa" w:w="3360"/>
+            <w:vAlign w:val="center"/>
+          </w:tcPr>
+          <w:p>
+            <w:r>
+              <w:rPr>
+                <w:b/>
+              </w:rPr>
+              <w:t>Stage</w:t>
+            </w:r>
+          </w:p>
+        </w:tc>
+        <w:tc>
+          <w:tcPr>
+            <w:tcW w:type="dxa" w:w="3360"/>
+            <w:vAlign w:val="center"/>
+          </w:tcPr>
+          <w:p>
+            <w:r>
+              <w:rPr>
+                <w:b/>
+              </w:rPr>
+              <w:t>Question to Answer</w:t>
+            </w:r>
+          </w:p>
+        </w:tc>
+        <w:tc>
+          <w:tcPr>
+            <w:tcW w:type="dxa" w:w="3360"/>
+            <w:vAlign w:val="center"/>
+          </w:tcPr>
+          <w:p>
+            <w:r>
+              <w:rPr>
+                <w:b/>
+              </w:rPr>
+              <w:t>Evidence of Completion</w:t>
+            </w:r>
+          </w:p>
+        </w:tc>
+      </w:tr>
+      <w:tr>
+        <w:tc>
+          <w:tcPr>
+            <w:tcW w:type="dxa" w:w="3360"/>
+            <w:vAlign w:val="center"/>
+          </w:tcPr>
+          <w:p>
+            <w:r>
+              <w:t>Understand</w:t>
+            </w:r>
+          </w:p>
+        </w:tc>
+        <w:tc>
+          <w:tcPr>
+            <w:tcW w:type="dxa" w:w="3360"/>
+            <w:vAlign w:val="center"/>
+          </w:tcPr>
+          <w:p>
+            <w:r>
+              <w:t>What exactly needs to change?</w:t>
+            </w:r>
+          </w:p>
+        </w:tc>
+        <w:tc>
+          <w:tcPr>
+            <w:tcW w:type="dxa" w:w="3360"/>
+            <w:vAlign w:val="center"/>
+          </w:tcPr>
+          <w:p>
+            <w:r>
+              <w:t>Clear requirement</w:t>
+            </w:r>
+          </w:p>
+        </w:tc>
+      </w:tr>
+      <w:tr>
+        <w:tc>
+          <w:tcPr>
+            <w:tcW w:type="dxa" w:w="3360"/>
+            <w:vAlign w:val="center"/>
+          </w:tcPr>
+          <w:p>
+            <w:r>
+              <w:t>Plan</w:t>
+            </w:r>
+          </w:p>
+        </w:tc>
+        <w:tc>
+          <w:tcPr>
+            <w:tcW w:type="dxa" w:w="3360"/>
+            <w:vAlign w:val="center"/>
+          </w:tcPr>
+          <w:p>
+            <w:r>
+              <w:t>How will the change be implemented?</w:t>
+            </w:r>
+          </w:p>
+        </w:tc>
+        <w:tc>
+          <w:tcPr>
+            <w:tcW w:type="dxa" w:w="3360"/>
+            <w:vAlign w:val="center"/>
+          </w:tcPr>
+          <w:p>
+            <w:r>
+              <w:t>Implementation approach</w:t>
+            </w:r>
+          </w:p>
+        </w:tc>
+      </w:tr>
+      <w:tr>
+        <w:tc>
+          <w:tcPr>
+            <w:tcW w:type="dxa" w:w="3360"/>
+            <w:vAlign w:val="center"/>
+          </w:tcPr>
+          <w:p>
+            <w:r>
+              <w:t>Build</w:t>
+            </w:r>
+          </w:p>
+        </w:tc>
+        <w:tc>
+          <w:tcPr>
+            <w:tcW w:type="dxa" w:w="3360"/>
+            <w:vAlign w:val="center"/>
+          </w:tcPr>
+          <w:p>
+            <w:r>
+              <w:t>What work is being performed?</w:t>
+            </w:r>
+          </w:p>
+        </w:tc>
+        <w:tc>
+          <w:tcPr>
+            <w:tcW w:type="dxa" w:w="3360"/>
+            <w:vAlign w:val="center"/>
+          </w:tcPr>
+          <w:p>
+            <w:r>
+              <w:t>Code or configuration</w:t>
+            </w:r>
+          </w:p>
+        </w:tc>
+      </w:tr>
+      <w:tr>
+        <w:tc>
+          <w:tcPr>
+            <w:tcW w:type="dxa" w:w="3360"/>
+            <w:vAlign w:val="center"/>
+          </w:tcPr>
+          <w:p>
+            <w:r>
+              <w:t>Validate</w:t>
+            </w:r>
+          </w:p>
+        </w:tc>
+        <w:tc>
+          <w:tcPr>
+            <w:tcW w:type="dxa" w:w="3360"/>
+            <w:vAlign w:val="center"/>
+          </w:tcPr>
+          <w:p>
+            <w:r>
+              <w:t>Does the result meet expectations?</w:t>
+            </w:r>
+          </w:p>
+        </w:tc>
+        <w:tc>
+          <w:tcPr>
+            <w:tcW w:type="dxa" w:w="3360"/>
+            <w:vAlign w:val="center"/>
+          </w:tcPr>
+          <w:p>
+            <w:r>
+              <w:t>Test results</w:t>
+            </w:r>
+          </w:p>
+        </w:tc>
+      </w:tr>
+      <w:tr>
+        <w:tc>
+          <w:tcPr>
+            <w:tcW w:type="dxa" w:w="3360"/>
+            <w:vAlign w:val="center"/>
+          </w:tcPr>
+          <w:p>
+            <w:r>
+              <w:t>Close</w:t>
+            </w:r>
+          </w:p>
+        </w:tc>
+        <w:tc>
+          <w:tcPr>
+            <w:tcW w:type="dxa" w:w="3360"/>
+            <w:vAlign w:val="center"/>
+          </w:tcPr>
+          <w:p>
+            <w:r>
+              <w:t>Is the work documented and delivered?</w:t>
+            </w:r>
+          </w:p>
+        </w:tc>
+        <w:tc>
+          <w:tcPr>
+            <w:tcW w:type="dxa" w:w="3360"/>
+            <w:vAlign w:val="center"/>
+          </w:tcPr>
+          <w:p>
+            <w:r>
+              <w:t>Completed task</w:t>
+            </w:r>
+          </w:p>
+        </w:tc>
+      </w:tr>
+    </w:tbl>
+    <w:p>
+      <w:pPr>
+        <w:pStyle w:val="Heading1"/>
+      </w:pPr>
+      <w:r>
+        <w:t>7. Communication Checklist</w:t>
+      </w:r>
+    </w:p>
+    <w:p>
+      <w:r>
+        <w:t>Before communicating project status, confirm what was completed, what remains, whether anything is blocked, and whether another person or team needs to take action. Short, factual updates make project coordination easier and reduce ambiguity.</w:t>
       </w:r>
     </w:p>
     <w:p>
@@ -137,136 +835,653 @@
         <w:jc w:val="center"/>
       </w:pPr>
       <w:r>
-        <w:drawing>
-          <wp:inline xmlns:a="http://schemas.openxmlformats.org/drawingml/2006/main" xmlns:pic="http://schemas.openxmlformats.org/drawingml/2006/picture">
-            <wp:extent cx="6309360" cy="3830683"/>
-            <wp:docPr id="2" name="Picture 2"/>
-            <wp:cNvGraphicFramePr>
-              <a:graphicFrameLocks noChangeAspect="1"/>
-            </wp:cNvGraphicFramePr>
-            <a:graphic>
-              <a:graphicData uri="http://schemas.openxmlformats.org/drawingml/2006/picture">
-                <pic:pic>
-                  <pic:nvPicPr>
-                    <pic:cNvPr id="0" name="code_of_conduct.png"/>
-                    <pic:cNvPicPr/>
-                  </pic:nvPicPr>
-                  <pic:blipFill>
-                    <a:blip r:embed="rId10"/>
-                    <a:stretch>
-                      <a:fillRect/>
-                    </a:stretch>
-                  </pic:blipFill>
-                  <pic:spPr>
-                    <a:xfrm>
-                      <a:off x="0" y="0"/>
-                      <a:ext cx="6309360" cy="3830683"/>
-                    </a:xfrm>
-                    <a:prstGeom prst="rect"/>
-                  </pic:spPr>
-                </pic:pic>
-              </a:graphicData>
-            </a:graphic>
-          </wp:inline>
-        </w:drawing>
+        <w:rPr>
+          <w:b/>
+          <w:sz w:val="42"/>
+        </w:rPr>
+        <w:t>Quality, Security and Daily Reference</w:t>
+      </w:r>
+    </w:p>
+    <w:p>
+      <w:pPr>
+        <w:pStyle w:val="Heading1"/>
+      </w:pPr>
+      <w:r>
+        <w:t>8. Quality Checklist</w:t>
       </w:r>
     </w:p>
     <w:p>
       <w:r>
-        <w:br w:type="page"/>
+        <w:t>Quality is not limited to whether software runs successfully. A completed change should also be understandable, tested, maintainable, and consistent with the project's existing conventions.</w:t>
+      </w:r>
+    </w:p>
+    <w:tbl>
+      <w:tblPr>
+        <w:tblStyle w:val="TableGrid"/>
+        <w:tblW w:type="auto" w:w="0"/>
+        <w:jc w:val="center"/>
+        <w:tblLook w:firstColumn="1" w:firstRow="1" w:lastColumn="0" w:lastRow="0" w:noHBand="0" w:noVBand="1" w:val="04A0"/>
+      </w:tblPr>
+      <w:tblGrid>
+        <w:gridCol w:w="3360"/>
+        <w:gridCol w:w="3360"/>
+        <w:gridCol w:w="3360"/>
+      </w:tblGrid>
+      <w:tr>
+        <w:tc>
+          <w:tcPr>
+            <w:tcW w:type="dxa" w:w="3360"/>
+            <w:vAlign w:val="center"/>
+          </w:tcPr>
+          <w:p>
+            <w:r>
+              <w:rPr>
+                <w:b/>
+              </w:rPr>
+              <w:t>Check</w:t>
+            </w:r>
+          </w:p>
+        </w:tc>
+        <w:tc>
+          <w:tcPr>
+            <w:tcW w:type="dxa" w:w="3360"/>
+            <w:vAlign w:val="center"/>
+          </w:tcPr>
+          <w:p>
+            <w:r>
+              <w:rPr>
+                <w:b/>
+              </w:rPr>
+              <w:t>Description</w:t>
+            </w:r>
+          </w:p>
+        </w:tc>
+        <w:tc>
+          <w:tcPr>
+            <w:tcW w:type="dxa" w:w="3360"/>
+            <w:vAlign w:val="center"/>
+          </w:tcPr>
+          <w:p>
+            <w:r>
+              <w:rPr>
+                <w:b/>
+              </w:rPr>
+              <w:t>Status</w:t>
+            </w:r>
+          </w:p>
+        </w:tc>
+      </w:tr>
+      <w:tr>
+        <w:tc>
+          <w:tcPr>
+            <w:tcW w:type="dxa" w:w="3360"/>
+            <w:vAlign w:val="center"/>
+          </w:tcPr>
+          <w:p>
+            <w:r>
+              <w:t>Requirement reviewed</w:t>
+            </w:r>
+          </w:p>
+        </w:tc>
+        <w:tc>
+          <w:tcPr>
+            <w:tcW w:type="dxa" w:w="3360"/>
+            <w:vAlign w:val="center"/>
+          </w:tcPr>
+          <w:p>
+            <w:r>
+              <w:t>The implementation matches the intended requirement.</w:t>
+            </w:r>
+          </w:p>
+        </w:tc>
+        <w:tc>
+          <w:tcPr>
+            <w:tcW w:type="dxa" w:w="3360"/>
+            <w:vAlign w:val="center"/>
+          </w:tcPr>
+          <w:p>
+            <w:r>
+              <w:t>☐</w:t>
+            </w:r>
+          </w:p>
+        </w:tc>
+      </w:tr>
+      <w:tr>
+        <w:tc>
+          <w:tcPr>
+            <w:tcW w:type="dxa" w:w="3360"/>
+            <w:vAlign w:val="center"/>
+          </w:tcPr>
+          <w:p>
+            <w:r>
+              <w:t>Edge cases considered</w:t>
+            </w:r>
+          </w:p>
+        </w:tc>
+        <w:tc>
+          <w:tcPr>
+            <w:tcW w:type="dxa" w:w="3360"/>
+            <w:vAlign w:val="center"/>
+          </w:tcPr>
+          <w:p>
+            <w:r>
+              <w:t>Important unusual inputs or conditions were considered.</w:t>
+            </w:r>
+          </w:p>
+        </w:tc>
+        <w:tc>
+          <w:tcPr>
+            <w:tcW w:type="dxa" w:w="3360"/>
+            <w:vAlign w:val="center"/>
+          </w:tcPr>
+          <w:p>
+            <w:r>
+              <w:t>☐</w:t>
+            </w:r>
+          </w:p>
+        </w:tc>
+      </w:tr>
+      <w:tr>
+        <w:tc>
+          <w:tcPr>
+            <w:tcW w:type="dxa" w:w="3360"/>
+            <w:vAlign w:val="center"/>
+          </w:tcPr>
+          <w:p>
+            <w:r>
+              <w:t>Tests completed</w:t>
+            </w:r>
+          </w:p>
+        </w:tc>
+        <w:tc>
+          <w:tcPr>
+            <w:tcW w:type="dxa" w:w="3360"/>
+            <w:vAlign w:val="center"/>
+          </w:tcPr>
+          <w:p>
+            <w:r>
+              <w:t>Relevant automated or manual tests were performed.</w:t>
+            </w:r>
+          </w:p>
+        </w:tc>
+        <w:tc>
+          <w:tcPr>
+            <w:tcW w:type="dxa" w:w="3360"/>
+            <w:vAlign w:val="center"/>
+          </w:tcPr>
+          <w:p>
+            <w:r>
+              <w:t>☐</w:t>
+            </w:r>
+          </w:p>
+        </w:tc>
+      </w:tr>
+      <w:tr>
+        <w:tc>
+          <w:tcPr>
+            <w:tcW w:type="dxa" w:w="3360"/>
+            <w:vAlign w:val="center"/>
+          </w:tcPr>
+          <w:p>
+            <w:r>
+              <w:t>Error handling reviewed</w:t>
+            </w:r>
+          </w:p>
+        </w:tc>
+        <w:tc>
+          <w:tcPr>
+            <w:tcW w:type="dxa" w:w="3360"/>
+            <w:vAlign w:val="center"/>
+          </w:tcPr>
+          <w:p>
+            <w:r>
+              <w:t>Expected failures are handled appropriately.</w:t>
+            </w:r>
+          </w:p>
+        </w:tc>
+        <w:tc>
+          <w:tcPr>
+            <w:tcW w:type="dxa" w:w="3360"/>
+            <w:vAlign w:val="center"/>
+          </w:tcPr>
+          <w:p>
+            <w:r>
+              <w:t>☐</w:t>
+            </w:r>
+          </w:p>
+        </w:tc>
+      </w:tr>
+      <w:tr>
+        <w:tc>
+          <w:tcPr>
+            <w:tcW w:type="dxa" w:w="3360"/>
+            <w:vAlign w:val="center"/>
+          </w:tcPr>
+          <w:p>
+            <w:r>
+              <w:t>Documentation updated</w:t>
+            </w:r>
+          </w:p>
+        </w:tc>
+        <w:tc>
+          <w:tcPr>
+            <w:tcW w:type="dxa" w:w="3360"/>
+            <w:vAlign w:val="center"/>
+          </w:tcPr>
+          <w:p>
+            <w:r>
+              <w:t>Necessary technical or user documentation is current.</w:t>
+            </w:r>
+          </w:p>
+        </w:tc>
+        <w:tc>
+          <w:tcPr>
+            <w:tcW w:type="dxa" w:w="3360"/>
+            <w:vAlign w:val="center"/>
+          </w:tcPr>
+          <w:p>
+            <w:r>
+              <w:t>☐</w:t>
+            </w:r>
+          </w:p>
+        </w:tc>
+      </w:tr>
+      <w:tr>
+        <w:tc>
+          <w:tcPr>
+            <w:tcW w:type="dxa" w:w="3360"/>
+            <w:vAlign w:val="center"/>
+          </w:tcPr>
+          <w:p>
+            <w:r>
+              <w:t>Peer review completed</w:t>
+            </w:r>
+          </w:p>
+        </w:tc>
+        <w:tc>
+          <w:tcPr>
+            <w:tcW w:type="dxa" w:w="3360"/>
+            <w:vAlign w:val="center"/>
+          </w:tcPr>
+          <w:p>
+            <w:r>
+              <w:t>Another team member has reviewed the change where required.</w:t>
+            </w:r>
+          </w:p>
+        </w:tc>
+        <w:tc>
+          <w:tcPr>
+            <w:tcW w:type="dxa" w:w="3360"/>
+            <w:vAlign w:val="center"/>
+          </w:tcPr>
+          <w:p>
+            <w:r>
+              <w:t>☐</w:t>
+            </w:r>
+          </w:p>
+        </w:tc>
+      </w:tr>
+    </w:tbl>
+    <w:p>
+      <w:pPr>
+        <w:pStyle w:val="Heading1"/>
+      </w:pPr>
+      <w:r>
+        <w:t>9. Information Security Basics</w:t>
+      </w:r>
+    </w:p>
+    <w:p>
+      <w:r>
+        <w:t>Company information should be accessed only through approved systems and only for legitimate work. Passwords, authentication tokens, confidential documents, and private customer information should not be shared through unauthorized channels. When an employee is unsure whether information can be shared, the appropriate security or management process should be followed.</w:t>
       </w:r>
     </w:p>
     <w:p>
       <w:pPr>
-        <w:jc w:val="center"/>
+        <w:pStyle w:val="Heading1"/>
       </w:pPr>
       <w:r>
-        <w:drawing>
-          <wp:inline xmlns:a="http://schemas.openxmlformats.org/drawingml/2006/main" xmlns:pic="http://schemas.openxmlformats.org/drawingml/2006/picture">
-            <wp:extent cx="6309360" cy="3830683"/>
-            <wp:docPr id="3" name="Picture 3"/>
-            <wp:cNvGraphicFramePr>
-              <a:graphicFrameLocks noChangeAspect="1"/>
-            </wp:cNvGraphicFramePr>
-            <a:graphic>
-              <a:graphicData uri="http://schemas.openxmlformats.org/drawingml/2006/picture">
-                <pic:pic>
-                  <pic:nvPicPr>
-                    <pic:cNvPr id="0" name="information_security.png"/>
-                    <pic:cNvPicPr/>
-                  </pic:nvPicPr>
-                  <pic:blipFill>
-                    <a:blip r:embed="rId11"/>
-                    <a:stretch>
-                      <a:fillRect/>
-                    </a:stretch>
-                  </pic:blipFill>
-                  <pic:spPr>
-                    <a:xfrm>
-                      <a:off x="0" y="0"/>
-                      <a:ext cx="6309360" cy="3830683"/>
-                    </a:xfrm>
-                    <a:prstGeom prst="rect"/>
-                  </pic:spPr>
-                </pic:pic>
-              </a:graphicData>
-            </a:graphic>
-          </wp:inline>
-        </w:drawing>
+        <w:t>10. Daily Work Record</w:t>
+      </w:r>
+    </w:p>
+    <w:tbl>
+      <w:tblPr>
+        <w:tblStyle w:val="TableGrid"/>
+        <w:tblW w:type="auto" w:w="0"/>
+        <w:jc w:val="center"/>
+        <w:tblLook w:firstColumn="1" w:firstRow="1" w:lastColumn="0" w:lastRow="0" w:noHBand="0" w:noVBand="1" w:val="04A0"/>
+      </w:tblPr>
+      <w:tblGrid>
+        <w:gridCol w:w="2520"/>
+        <w:gridCol w:w="2520"/>
+        <w:gridCol w:w="2520"/>
+        <w:gridCol w:w="2520"/>
+      </w:tblGrid>
+      <w:tr>
+        <w:tc>
+          <w:tcPr>
+            <w:tcW w:type="dxa" w:w="2520"/>
+            <w:vAlign w:val="center"/>
+          </w:tcPr>
+          <w:p>
+            <w:r>
+              <w:rPr>
+                <w:b/>
+              </w:rPr>
+              <w:t>Date</w:t>
+            </w:r>
+          </w:p>
+        </w:tc>
+        <w:tc>
+          <w:tcPr>
+            <w:tcW w:type="dxa" w:w="2520"/>
+            <w:vAlign w:val="center"/>
+          </w:tcPr>
+          <w:p>
+            <w:r>
+              <w:rPr>
+                <w:b/>
+              </w:rPr>
+              <w:t>Task / Activity</w:t>
+            </w:r>
+          </w:p>
+        </w:tc>
+        <w:tc>
+          <w:tcPr>
+            <w:tcW w:type="dxa" w:w="2520"/>
+            <w:vAlign w:val="center"/>
+          </w:tcPr>
+          <w:p>
+            <w:r>
+              <w:rPr>
+                <w:b/>
+              </w:rPr>
+              <w:t>Result</w:t>
+            </w:r>
+          </w:p>
+        </w:tc>
+        <w:tc>
+          <w:tcPr>
+            <w:tcW w:type="dxa" w:w="2520"/>
+            <w:vAlign w:val="center"/>
+          </w:tcPr>
+          <w:p>
+            <w:r>
+              <w:rPr>
+                <w:b/>
+              </w:rPr>
+              <w:t>Follow-up</w:t>
+            </w:r>
+          </w:p>
+        </w:tc>
+      </w:tr>
+      <w:tr>
+        <w:tc>
+          <w:tcPr>
+            <w:tcW w:type="dxa" w:w="2520"/>
+            <w:vAlign w:val="center"/>
+          </w:tcPr>
+          <w:p>
+            <w:r>
+              <w:t>____________</w:t>
+            </w:r>
+          </w:p>
+        </w:tc>
+        <w:tc>
+          <w:tcPr>
+            <w:tcW w:type="dxa" w:w="2520"/>
+            <w:vAlign w:val="center"/>
+          </w:tcPr>
+          <w:p>
+            <w:r>
+              <w:t>________________________</w:t>
+            </w:r>
+          </w:p>
+        </w:tc>
+        <w:tc>
+          <w:tcPr>
+            <w:tcW w:type="dxa" w:w="2520"/>
+            <w:vAlign w:val="center"/>
+          </w:tcPr>
+          <w:p>
+            <w:r>
+              <w:t>________________</w:t>
+            </w:r>
+          </w:p>
+        </w:tc>
+        <w:tc>
+          <w:tcPr>
+            <w:tcW w:type="dxa" w:w="2520"/>
+            <w:vAlign w:val="center"/>
+          </w:tcPr>
+          <w:p>
+            <w:r>
+              <w:t>________________</w:t>
+            </w:r>
+          </w:p>
+        </w:tc>
+      </w:tr>
+      <w:tr>
+        <w:tc>
+          <w:tcPr>
+            <w:tcW w:type="dxa" w:w="2520"/>
+            <w:vAlign w:val="center"/>
+          </w:tcPr>
+          <w:p>
+            <w:r>
+              <w:t>____________</w:t>
+            </w:r>
+          </w:p>
+        </w:tc>
+        <w:tc>
+          <w:tcPr>
+            <w:tcW w:type="dxa" w:w="2520"/>
+            <w:vAlign w:val="center"/>
+          </w:tcPr>
+          <w:p>
+            <w:r>
+              <w:t>________________________</w:t>
+            </w:r>
+          </w:p>
+        </w:tc>
+        <w:tc>
+          <w:tcPr>
+            <w:tcW w:type="dxa" w:w="2520"/>
+            <w:vAlign w:val="center"/>
+          </w:tcPr>
+          <w:p>
+            <w:r>
+              <w:t>________________</w:t>
+            </w:r>
+          </w:p>
+        </w:tc>
+        <w:tc>
+          <w:tcPr>
+            <w:tcW w:type="dxa" w:w="2520"/>
+            <w:vAlign w:val="center"/>
+          </w:tcPr>
+          <w:p>
+            <w:r>
+              <w:t>________________</w:t>
+            </w:r>
+          </w:p>
+        </w:tc>
+      </w:tr>
+      <w:tr>
+        <w:tc>
+          <w:tcPr>
+            <w:tcW w:type="dxa" w:w="2520"/>
+            <w:vAlign w:val="center"/>
+          </w:tcPr>
+          <w:p>
+            <w:r>
+              <w:t>____________</w:t>
+            </w:r>
+          </w:p>
+        </w:tc>
+        <w:tc>
+          <w:tcPr>
+            <w:tcW w:type="dxa" w:w="2520"/>
+            <w:vAlign w:val="center"/>
+          </w:tcPr>
+          <w:p>
+            <w:r>
+              <w:t>________________________</w:t>
+            </w:r>
+          </w:p>
+        </w:tc>
+        <w:tc>
+          <w:tcPr>
+            <w:tcW w:type="dxa" w:w="2520"/>
+            <w:vAlign w:val="center"/>
+          </w:tcPr>
+          <w:p>
+            <w:r>
+              <w:t>________________</w:t>
+            </w:r>
+          </w:p>
+        </w:tc>
+        <w:tc>
+          <w:tcPr>
+            <w:tcW w:type="dxa" w:w="2520"/>
+            <w:vAlign w:val="center"/>
+          </w:tcPr>
+          <w:p>
+            <w:r>
+              <w:t>________________</w:t>
+            </w:r>
+          </w:p>
+        </w:tc>
+      </w:tr>
+      <w:tr>
+        <w:tc>
+          <w:tcPr>
+            <w:tcW w:type="dxa" w:w="2520"/>
+            <w:vAlign w:val="center"/>
+          </w:tcPr>
+          <w:p>
+            <w:r>
+              <w:t>____________</w:t>
+            </w:r>
+          </w:p>
+        </w:tc>
+        <w:tc>
+          <w:tcPr>
+            <w:tcW w:type="dxa" w:w="2520"/>
+            <w:vAlign w:val="center"/>
+          </w:tcPr>
+          <w:p>
+            <w:r>
+              <w:t>________________________</w:t>
+            </w:r>
+          </w:p>
+        </w:tc>
+        <w:tc>
+          <w:tcPr>
+            <w:tcW w:type="dxa" w:w="2520"/>
+            <w:vAlign w:val="center"/>
+          </w:tcPr>
+          <w:p>
+            <w:r>
+              <w:t>________________</w:t>
+            </w:r>
+          </w:p>
+        </w:tc>
+        <w:tc>
+          <w:tcPr>
+            <w:tcW w:type="dxa" w:w="2520"/>
+            <w:vAlign w:val="center"/>
+          </w:tcPr>
+          <w:p>
+            <w:r>
+              <w:t>________________</w:t>
+            </w:r>
+          </w:p>
+        </w:tc>
+      </w:tr>
+      <w:tr>
+        <w:tc>
+          <w:tcPr>
+            <w:tcW w:type="dxa" w:w="2520"/>
+            <w:vAlign w:val="center"/>
+          </w:tcPr>
+          <w:p>
+            <w:r>
+              <w:t>____________</w:t>
+            </w:r>
+          </w:p>
+        </w:tc>
+        <w:tc>
+          <w:tcPr>
+            <w:tcW w:type="dxa" w:w="2520"/>
+            <w:vAlign w:val="center"/>
+          </w:tcPr>
+          <w:p>
+            <w:r>
+              <w:t>________________________</w:t>
+            </w:r>
+          </w:p>
+        </w:tc>
+        <w:tc>
+          <w:tcPr>
+            <w:tcW w:type="dxa" w:w="2520"/>
+            <w:vAlign w:val="center"/>
+          </w:tcPr>
+          <w:p>
+            <w:r>
+              <w:t>________________</w:t>
+            </w:r>
+          </w:p>
+        </w:tc>
+        <w:tc>
+          <w:tcPr>
+            <w:tcW w:type="dxa" w:w="2520"/>
+            <w:vAlign w:val="center"/>
+          </w:tcPr>
+          <w:p>
+            <w:r>
+              <w:t>________________</w:t>
+            </w:r>
+          </w:p>
+        </w:tc>
+      </w:tr>
+    </w:tbl>
+    <w:p>
+      <w:pPr>
+        <w:pStyle w:val="Heading1"/>
+      </w:pPr>
+      <w:r>
+        <w:t>11. Final Reference Notes</w:t>
       </w:r>
     </w:p>
     <w:p>
       <w:r>
-        <w:br w:type="page"/>
-      </w:r>
-    </w:p>
-    <w:p>
-      <w:pPr>
-        <w:jc w:val="center"/>
-      </w:pPr>
-      <w:r>
-        <w:drawing>
-          <wp:inline xmlns:a="http://schemas.openxmlformats.org/drawingml/2006/main" xmlns:pic="http://schemas.openxmlformats.org/drawingml/2006/picture">
-            <wp:extent cx="6309360" cy="3830683"/>
-            <wp:docPr id="4" name="Picture 4"/>
-            <wp:cNvGraphicFramePr>
-              <a:graphicFrameLocks noChangeAspect="1"/>
-            </wp:cNvGraphicFramePr>
-            <a:graphic>
-              <a:graphicData uri="http://schemas.openxmlformats.org/drawingml/2006/picture">
-                <pic:pic>
-                  <pic:nvPicPr>
-                    <pic:cNvPr id="0" name="remote_work.png"/>
-                    <pic:cNvPicPr/>
-                  </pic:nvPicPr>
-                  <pic:blipFill>
-                    <a:blip r:embed="rId12"/>
-                    <a:stretch>
-                      <a:fillRect/>
-                    </a:stretch>
-                  </pic:blipFill>
-                  <pic:spPr>
-                    <a:xfrm>
-                      <a:off x="0" y="0"/>
-                      <a:ext cx="6309360" cy="3830683"/>
-                    </a:xfrm>
-                    <a:prstGeom prst="rect"/>
-                  </pic:spPr>
-                </pic:pic>
-              </a:graphicData>
-            </a:graphic>
-          </wp:inline>
-        </w:drawing>
+        <w:t>Keep important requirements, decisions, assumptions, and outcomes documented. When a process is unclear, identify the specific question and ask the appropriate person. When a task is completed, record enough context that another team member can understand what changed and why.</w:t>
       </w:r>
     </w:p>
     <w:sectPr>
+      <w:footerReference w:type="default" r:id="rId9"/>
       <w:pgSz w:w="12240" w:h="15840"/>
-      <w:pgMar w:top="936" w:right="1080" w:bottom="936" w:left="1080" w:header="720" w:footer="720" w:gutter="0"/>
+      <w:pgMar w:top="1008" w:right="1080" w:bottom="1008" w:left="1080" w:header="720" w:footer="720" w:gutter="0"/>
       <w:cols w:space="720"/>
       <w:docGrid w:linePitch="360"/>
     </w:sectPr>
   </w:body>
 </w:document>
+</file>
+
+<file path=word/footer1.xml><?xml version="1.0" encoding="utf-8"?>
+<w:ftr xmlns:m="http://schemas.openxmlformats.org/officeDocument/2006/math" xmlns:mc="http://schemas.openxmlformats.org/markup-compatibility/2006" xmlns:mo="http://schemas.microsoft.com/office/mac/office/2008/main" xmlns:mv="urn:schemas-microsoft-com:mac:vml" xmlns:o="urn:schemas-microsoft-com:office:office" xmlns:r="http://schemas.openxmlformats.org/officeDocument/2006/relationships" xmlns:v="urn:schemas-microsoft-com:vml" xmlns:w10="urn:schemas-microsoft-com:office:word" xmlns:w14="http://schemas.microsoft.com/office/word/2010/wordml" xmlns:w="http://schemas.openxmlformats.org/wordprocessingml/2006/main" xmlns:wne="http://schemas.microsoft.com/office/word/2006/wordml" xmlns:wp14="http://schemas.microsoft.com/office/word/2010/wordprocessingDrawing" xmlns:wp="http://schemas.openxmlformats.org/drawingml/2006/wordprocessingDrawing" xmlns:wpc="http://schemas.microsoft.com/office/word/2010/wordprocessingCanvas" xmlns:wpg="http://schemas.microsoft.com/office/word/2010/wordprocessingGroup" xmlns:wpi="http://schemas.microsoft.com/office/word/2010/wordprocessingInk" xmlns:wps="http://schemas.microsoft.com/office/word/2010/wordprocessingShape" mc:Ignorable="w14 wp14">
+  <w:p>
+    <w:pPr>
+      <w:pStyle w:val="Footer"/>
+      <w:jc w:val="center"/>
+    </w:pPr>
+    <w:r>
+      <w:t xml:space="preserve">Employee Reference Document  |  </w:t>
+    </w:r>
+    <w:fldSimple w:instr="PAGE"/>
+  </w:p>
+</w:ftr>
 </file>
 
 <file path=word/numbering.xml><?xml version="1.0" encoding="utf-8"?>
@@ -633,8 +1848,8 @@
     <w:qFormat/>
     <w:rsid w:val="00FC693F"/>
     <w:rPr>
-      <w:rFonts w:ascii="Arial" w:hAnsi="Arial"/>
-      <w:sz w:val="20"/>
+      <w:rFonts w:ascii="Aptos" w:hAnsi="Aptos"/>
+      <w:sz w:val="21"/>
     </w:rPr>
   </w:style>
   <w:style w:type="paragraph" w:styleId="Header">

</xml_diff>

<commit_message>
Replaced SmolVLM with Qwen2VL 2B and quantized it
</commit_message>
<xml_diff>
--- a/input/DOC-001.docx
+++ b/input/DOC-001.docx
@@ -9,292 +9,53 @@
       <w:r>
         <w:rPr>
           <w:b/>
-          <w:sz w:val="42"/>
+          <w:sz w:val="38"/>
         </w:rPr>
-        <w:t>Employee Onboarding Guide</w:t>
-      </w:r>
-    </w:p>
-    <w:p>
-      <w:pPr>
-        <w:jc w:val="center"/>
-      </w:pPr>
-      <w:r>
-        <w:rPr>
-          <w:i/>
-          <w:sz w:val="22"/>
-        </w:rPr>
-        <w:t>A practical reference for new team members</w:t>
-      </w:r>
-    </w:p>
-    <w:p>
-      <w:pPr>
-        <w:pStyle w:val="Heading1"/>
-      </w:pPr>
-      <w:r>
-        <w:t>1. Welcome to the Organization</w:t>
+        <w:t>NEW EMPLOYEE ONBOARDING GUIDE — TEST DOCUMENT</w:t>
       </w:r>
     </w:p>
     <w:p>
       <w:r>
-        <w:t>Starting a new role involves learning the organization, understanding responsibilities, meeting colleagues, and becoming familiar with the tools used every day. This guide provides a simple reference that a new employee can use during the first few weeks.</w:t>
+        <w:rPr>
+          <w:b/>
+        </w:rPr>
+        <w:t xml:space="preserve">Employee onboarding begins before the first working day and continues through the employee's first month. </w:t>
       </w:r>
-    </w:p>
-    <w:p>
-      <w:pPr>
-        <w:pStyle w:val="Heading1"/>
-      </w:pPr>
       <w:r>
-        <w:t>2. First-Week Objectives</w:t>
+        <w:t>The manager, HR, IT, and the employee share responsibility for completing the onboarding activities and ensuring the employee has the information and access needed to work effectively.</w:t>
       </w:r>
     </w:p>
     <w:p>
       <w:r>
-        <w:t>During the first week, the employee should focus on understanding the team's purpose, completing required access requests, reviewing important documentation, and identifying the people who can provide help when questions arise.</w:t>
+        <w:rPr>
+          <w:b/>
+        </w:rPr>
+        <w:t xml:space="preserve">Onboarding Objective: </w:t>
       </w:r>
-    </w:p>
-    <w:tbl>
-      <w:tblPr>
-        <w:tblStyle w:val="TableGrid"/>
-        <w:tblW w:type="auto" w:w="0"/>
-        <w:jc w:val="center"/>
-        <w:tblLook w:firstColumn="1" w:firstRow="1" w:lastColumn="0" w:lastRow="0" w:noHBand="0" w:noVBand="1" w:val="04A0"/>
-      </w:tblPr>
-      <w:tblGrid>
-        <w:gridCol w:w="3360"/>
-        <w:gridCol w:w="3360"/>
-        <w:gridCol w:w="3360"/>
-      </w:tblGrid>
-      <w:tr>
-        <w:tc>
-          <w:tcPr>
-            <w:tcW w:type="dxa" w:w="3360"/>
-            <w:vAlign w:val="center"/>
-          </w:tcPr>
-          <w:p>
-            <w:r>
-              <w:rPr>
-                <w:b/>
-              </w:rPr>
-              <w:t>Activity</w:t>
-            </w:r>
-          </w:p>
-        </w:tc>
-        <w:tc>
-          <w:tcPr>
-            <w:tcW w:type="dxa" w:w="3360"/>
-            <w:vAlign w:val="center"/>
-          </w:tcPr>
-          <w:p>
-            <w:r>
-              <w:rPr>
-                <w:b/>
-              </w:rPr>
-              <w:t>Expected Outcome</w:t>
-            </w:r>
-          </w:p>
-        </w:tc>
-        <w:tc>
-          <w:tcPr>
-            <w:tcW w:type="dxa" w:w="3360"/>
-            <w:vAlign w:val="center"/>
-          </w:tcPr>
-          <w:p>
-            <w:r>
-              <w:rPr>
-                <w:b/>
-              </w:rPr>
-              <w:t>Suggested Timing</w:t>
-            </w:r>
-          </w:p>
-        </w:tc>
-      </w:tr>
-      <w:tr>
-        <w:tc>
-          <w:tcPr>
-            <w:tcW w:type="dxa" w:w="3360"/>
-            <w:vAlign w:val="center"/>
-          </w:tcPr>
-          <w:p>
-            <w:r>
-              <w:t>Complete introduction</w:t>
-            </w:r>
-          </w:p>
-        </w:tc>
-        <w:tc>
-          <w:tcPr>
-            <w:tcW w:type="dxa" w:w="3360"/>
-            <w:vAlign w:val="center"/>
-          </w:tcPr>
-          <w:p>
-            <w:r>
-              <w:t>Meet manager and immediate team</w:t>
-            </w:r>
-          </w:p>
-        </w:tc>
-        <w:tc>
-          <w:tcPr>
-            <w:tcW w:type="dxa" w:w="3360"/>
-            <w:vAlign w:val="center"/>
-          </w:tcPr>
-          <w:p>
-            <w:r>
-              <w:t>Day 1</w:t>
-            </w:r>
-          </w:p>
-        </w:tc>
-      </w:tr>
-      <w:tr>
-        <w:tc>
-          <w:tcPr>
-            <w:tcW w:type="dxa" w:w="3360"/>
-            <w:vAlign w:val="center"/>
-          </w:tcPr>
-          <w:p>
-            <w:r>
-              <w:t>Set up accounts</w:t>
-            </w:r>
-          </w:p>
-        </w:tc>
-        <w:tc>
-          <w:tcPr>
-            <w:tcW w:type="dxa" w:w="3360"/>
-            <w:vAlign w:val="center"/>
-          </w:tcPr>
-          <w:p>
-            <w:r>
-              <w:t>Required systems are accessible</w:t>
-            </w:r>
-          </w:p>
-        </w:tc>
-        <w:tc>
-          <w:tcPr>
-            <w:tcW w:type="dxa" w:w="3360"/>
-            <w:vAlign w:val="center"/>
-          </w:tcPr>
-          <w:p>
-            <w:r>
-              <w:t>Day 1–2</w:t>
-            </w:r>
-          </w:p>
-        </w:tc>
-      </w:tr>
-      <w:tr>
-        <w:tc>
-          <w:tcPr>
-            <w:tcW w:type="dxa" w:w="3360"/>
-            <w:vAlign w:val="center"/>
-          </w:tcPr>
-          <w:p>
-            <w:r>
-              <w:t>Review documentation</w:t>
-            </w:r>
-          </w:p>
-        </w:tc>
-        <w:tc>
-          <w:tcPr>
-            <w:tcW w:type="dxa" w:w="3360"/>
-            <w:vAlign w:val="center"/>
-          </w:tcPr>
-          <w:p>
-            <w:r>
-              <w:t>Understand basic policies and processes</w:t>
-            </w:r>
-          </w:p>
-        </w:tc>
-        <w:tc>
-          <w:tcPr>
-            <w:tcW w:type="dxa" w:w="3360"/>
-            <w:vAlign w:val="center"/>
-          </w:tcPr>
-          <w:p>
-            <w:r>
-              <w:t>Day 2–3</w:t>
-            </w:r>
-          </w:p>
-        </w:tc>
-      </w:tr>
-      <w:tr>
-        <w:tc>
-          <w:tcPr>
-            <w:tcW w:type="dxa" w:w="3360"/>
-            <w:vAlign w:val="center"/>
-          </w:tcPr>
-          <w:p>
-            <w:r>
-              <w:t>Attend team meeting</w:t>
-            </w:r>
-          </w:p>
-        </w:tc>
-        <w:tc>
-          <w:tcPr>
-            <w:tcW w:type="dxa" w:w="3360"/>
-            <w:vAlign w:val="center"/>
-          </w:tcPr>
-          <w:p>
-            <w:r>
-              <w:t>Understand current priorities</w:t>
-            </w:r>
-          </w:p>
-        </w:tc>
-        <w:tc>
-          <w:tcPr>
-            <w:tcW w:type="dxa" w:w="3360"/>
-            <w:vAlign w:val="center"/>
-          </w:tcPr>
-          <w:p>
-            <w:r>
-              <w:t>Day 2–5</w:t>
-            </w:r>
-          </w:p>
-        </w:tc>
-      </w:tr>
-      <w:tr>
-        <w:tc>
-          <w:tcPr>
-            <w:tcW w:type="dxa" w:w="3360"/>
-            <w:vAlign w:val="center"/>
-          </w:tcPr>
-          <w:p>
-            <w:r>
-              <w:t>Confirm responsibilities</w:t>
-            </w:r>
-          </w:p>
-        </w:tc>
-        <w:tc>
-          <w:tcPr>
-            <w:tcW w:type="dxa" w:w="3360"/>
-            <w:vAlign w:val="center"/>
-          </w:tcPr>
-          <w:p>
-            <w:r>
-              <w:t>Know initial tasks and expectations</w:t>
-            </w:r>
-          </w:p>
-        </w:tc>
-        <w:tc>
-          <w:tcPr>
-            <w:tcW w:type="dxa" w:w="3360"/>
-            <w:vAlign w:val="center"/>
-          </w:tcPr>
-          <w:p>
-            <w:r>
-              <w:t>By Day 5</w:t>
-            </w:r>
-          </w:p>
-        </w:tc>
-      </w:tr>
-    </w:tbl>
-    <w:p>
-      <w:pPr>
-        <w:pStyle w:val="Heading1"/>
-      </w:pPr>
       <w:r>
-        <w:t>3. Important Working Principles</w:t>
+        <w:t>Help a new employee understand the organization, team, role, workplace expectations, security responsibilities, and the systems required to perform their work.</w:t>
       </w:r>
     </w:p>
     <w:p>
       <w:r>
-        <w:t>Employees are expected to communicate clearly, protect company information, follow established processes, ask questions when requirements are unclear, and document important decisions. Good documentation reduces repeated work and helps other team members understand the context behind a task.</w:t>
+        <w:rPr>
+          <w:b/>
+        </w:rPr>
+        <w:t xml:space="preserve">Key Responsibilities: </w:t>
+      </w:r>
+      <w:r>
+        <w:t>HR handles employment documentation and policy orientation. IT provisions approved devices and accounts. The manager provides role context, introduces the team, assigns initial work, and schedules progress discussions.</w:t>
+      </w:r>
+    </w:p>
+    <w:p>
+      <w:r>
+        <w:rPr>
+          <w:b/>
+        </w:rPr>
+        <w:t xml:space="preserve">Access Principle: </w:t>
+      </w:r>
+      <w:r>
+        <w:t>Employees should receive only the systems and project resources required for their role. Access requests should follow the organization's approval process.</w:t>
       </w:r>
     </w:p>
     <w:p>
@@ -307,1181 +68,48 @@
         <w:jc w:val="center"/>
       </w:pPr>
       <w:r>
-        <w:rPr>
-          <w:b/>
-          <w:sz w:val="42"/>
-        </w:rPr>
-        <w:t>Project Operations Reference</w:t>
-      </w:r>
-    </w:p>
-    <w:p>
-      <w:pPr>
-        <w:pStyle w:val="Heading1"/>
-      </w:pPr>
-      <w:r>
-        <w:t>4. Understanding a Project</w:t>
-      </w:r>
-    </w:p>
-    <w:p>
-      <w:r>
-        <w:t>A project is a coordinated set of activities intended to produce a defined outcome. Projects normally have objectives, stakeholders, timelines, deliverables, dependencies, and acceptance criteria. Understanding these elements helps an employee connect individual tasks with the broader project goal.</w:t>
-      </w:r>
-    </w:p>
-    <w:p>
-      <w:pPr>
-        <w:pStyle w:val="Heading1"/>
-      </w:pPr>
-      <w:r>
-        <w:t>5. Project Roles and Responsibilities</w:t>
-      </w:r>
-    </w:p>
-    <w:tbl>
-      <w:tblPr>
-        <w:tblStyle w:val="TableGrid"/>
-        <w:tblW w:type="auto" w:w="0"/>
-        <w:jc w:val="center"/>
-        <w:tblLook w:firstColumn="1" w:firstRow="1" w:lastColumn="0" w:lastRow="0" w:noHBand="0" w:noVBand="1" w:val="04A0"/>
-      </w:tblPr>
-      <w:tblGrid>
-        <w:gridCol w:w="3360"/>
-        <w:gridCol w:w="3360"/>
-        <w:gridCol w:w="3360"/>
-      </w:tblGrid>
-      <w:tr>
-        <w:tc>
-          <w:tcPr>
-            <w:tcW w:type="dxa" w:w="3360"/>
-            <w:vAlign w:val="center"/>
-          </w:tcPr>
-          <w:p>
-            <w:r>
-              <w:rPr>
-                <w:b/>
-              </w:rPr>
-              <w:t>Role</w:t>
-            </w:r>
-          </w:p>
-        </w:tc>
-        <w:tc>
-          <w:tcPr>
-            <w:tcW w:type="dxa" w:w="3360"/>
-            <w:vAlign w:val="center"/>
-          </w:tcPr>
-          <w:p>
-            <w:r>
-              <w:rPr>
-                <w:b/>
-              </w:rPr>
-              <w:t>Primary Responsibility</w:t>
-            </w:r>
-          </w:p>
-        </w:tc>
-        <w:tc>
-          <w:tcPr>
-            <w:tcW w:type="dxa" w:w="3360"/>
-            <w:vAlign w:val="center"/>
-          </w:tcPr>
-          <w:p>
-            <w:r>
-              <w:rPr>
-                <w:b/>
-              </w:rPr>
-              <w:t>Typical Interaction</w:t>
-            </w:r>
-          </w:p>
-        </w:tc>
-      </w:tr>
-      <w:tr>
-        <w:tc>
-          <w:tcPr>
-            <w:tcW w:type="dxa" w:w="3360"/>
-            <w:vAlign w:val="center"/>
-          </w:tcPr>
-          <w:p>
-            <w:r>
-              <w:t>Project Manager</w:t>
-            </w:r>
-          </w:p>
-        </w:tc>
-        <w:tc>
-          <w:tcPr>
-            <w:tcW w:type="dxa" w:w="3360"/>
-            <w:vAlign w:val="center"/>
-          </w:tcPr>
-          <w:p>
-            <w:r>
-              <w:t>Planning, coordination, status tracking</w:t>
-            </w:r>
-          </w:p>
-        </w:tc>
-        <w:tc>
-          <w:tcPr>
-            <w:tcW w:type="dxa" w:w="3360"/>
-            <w:vAlign w:val="center"/>
-          </w:tcPr>
-          <w:p>
-            <w:r>
-              <w:t>Team and stakeholders</w:t>
-            </w:r>
-          </w:p>
-        </w:tc>
-      </w:tr>
-      <w:tr>
-        <w:tc>
-          <w:tcPr>
-            <w:tcW w:type="dxa" w:w="3360"/>
-            <w:vAlign w:val="center"/>
-          </w:tcPr>
-          <w:p>
-            <w:r>
-              <w:t>Technical Lead</w:t>
-            </w:r>
-          </w:p>
-        </w:tc>
-        <w:tc>
-          <w:tcPr>
-            <w:tcW w:type="dxa" w:w="3360"/>
-            <w:vAlign w:val="center"/>
-          </w:tcPr>
-          <w:p>
-            <w:r>
-              <w:t>Technical direction and design decisions</w:t>
-            </w:r>
-          </w:p>
-        </w:tc>
-        <w:tc>
-          <w:tcPr>
-            <w:tcW w:type="dxa" w:w="3360"/>
-            <w:vAlign w:val="center"/>
-          </w:tcPr>
-          <w:p>
-            <w:r>
-              <w:t>Developers and architects</w:t>
-            </w:r>
-          </w:p>
-        </w:tc>
-      </w:tr>
-      <w:tr>
-        <w:tc>
-          <w:tcPr>
-            <w:tcW w:type="dxa" w:w="3360"/>
-            <w:vAlign w:val="center"/>
-          </w:tcPr>
-          <w:p>
-            <w:r>
-              <w:t>Developer</w:t>
-            </w:r>
-          </w:p>
-        </w:tc>
-        <w:tc>
-          <w:tcPr>
-            <w:tcW w:type="dxa" w:w="3360"/>
-            <w:vAlign w:val="center"/>
-          </w:tcPr>
-          <w:p>
-            <w:r>
-              <w:t>Implementation and technical changes</w:t>
-            </w:r>
-          </w:p>
-        </w:tc>
-        <w:tc>
-          <w:tcPr>
-            <w:tcW w:type="dxa" w:w="3360"/>
-            <w:vAlign w:val="center"/>
-          </w:tcPr>
-          <w:p>
-            <w:r>
-              <w:t>Technical team</w:t>
-            </w:r>
-          </w:p>
-        </w:tc>
-      </w:tr>
-      <w:tr>
-        <w:tc>
-          <w:tcPr>
-            <w:tcW w:type="dxa" w:w="3360"/>
-            <w:vAlign w:val="center"/>
-          </w:tcPr>
-          <w:p>
-            <w:r>
-              <w:t>QA / Tester</w:t>
-            </w:r>
-          </w:p>
-        </w:tc>
-        <w:tc>
-          <w:tcPr>
-            <w:tcW w:type="dxa" w:w="3360"/>
-            <w:vAlign w:val="center"/>
-          </w:tcPr>
-          <w:p>
-            <w:r>
-              <w:t>Validation and defect reporting</w:t>
-            </w:r>
-          </w:p>
-        </w:tc>
-        <w:tc>
-          <w:tcPr>
-            <w:tcW w:type="dxa" w:w="3360"/>
-            <w:vAlign w:val="center"/>
-          </w:tcPr>
-          <w:p>
-            <w:r>
-              <w:t>Developers and project team</w:t>
-            </w:r>
-          </w:p>
-        </w:tc>
-      </w:tr>
-      <w:tr>
-        <w:tc>
-          <w:tcPr>
-            <w:tcW w:type="dxa" w:w="3360"/>
-            <w:vAlign w:val="center"/>
-          </w:tcPr>
-          <w:p>
-            <w:r>
-              <w:t>Business Stakeholder</w:t>
-            </w:r>
-          </w:p>
-        </w:tc>
-        <w:tc>
-          <w:tcPr>
-            <w:tcW w:type="dxa" w:w="3360"/>
-            <w:vAlign w:val="center"/>
-          </w:tcPr>
-          <w:p>
-            <w:r>
-              <w:t>Requirements and business expectations</w:t>
-            </w:r>
-          </w:p>
-        </w:tc>
-        <w:tc>
-          <w:tcPr>
-            <w:tcW w:type="dxa" w:w="3360"/>
-            <w:vAlign w:val="center"/>
-          </w:tcPr>
-          <w:p>
-            <w:r>
-              <w:t>Project leadership</w:t>
-            </w:r>
-          </w:p>
-        </w:tc>
-      </w:tr>
-    </w:tbl>
-    <w:p>
-      <w:pPr>
-        <w:pStyle w:val="Heading1"/>
-      </w:pPr>
-      <w:r>
-        <w:t>6. Task Lifecycle</w:t>
-      </w:r>
-    </w:p>
-    <w:p>
-      <w:r>
-        <w:t>A task generally begins with a clear requirement. The owner then investigates the requirement, plans the implementation, performs the work, validates the result, and records the outcome. If a dependency or blocker appears, it should be communicated early rather than discovered near the deadline.</w:t>
-      </w:r>
-    </w:p>
-    <w:tbl>
-      <w:tblPr>
-        <w:tblStyle w:val="TableGrid"/>
-        <w:tblW w:type="auto" w:w="0"/>
-        <w:jc w:val="center"/>
-        <w:tblLook w:firstColumn="1" w:firstRow="1" w:lastColumn="0" w:lastRow="0" w:noHBand="0" w:noVBand="1" w:val="04A0"/>
-      </w:tblPr>
-      <w:tblGrid>
-        <w:gridCol w:w="3360"/>
-        <w:gridCol w:w="3360"/>
-        <w:gridCol w:w="3360"/>
-      </w:tblGrid>
-      <w:tr>
-        <w:tc>
-          <w:tcPr>
-            <w:tcW w:type="dxa" w:w="3360"/>
-            <w:vAlign w:val="center"/>
-          </w:tcPr>
-          <w:p>
-            <w:r>
-              <w:rPr>
-                <w:b/>
-              </w:rPr>
-              <w:t>Stage</w:t>
-            </w:r>
-          </w:p>
-        </w:tc>
-        <w:tc>
-          <w:tcPr>
-            <w:tcW w:type="dxa" w:w="3360"/>
-            <w:vAlign w:val="center"/>
-          </w:tcPr>
-          <w:p>
-            <w:r>
-              <w:rPr>
-                <w:b/>
-              </w:rPr>
-              <w:t>Question to Answer</w:t>
-            </w:r>
-          </w:p>
-        </w:tc>
-        <w:tc>
-          <w:tcPr>
-            <w:tcW w:type="dxa" w:w="3360"/>
-            <w:vAlign w:val="center"/>
-          </w:tcPr>
-          <w:p>
-            <w:r>
-              <w:rPr>
-                <w:b/>
-              </w:rPr>
-              <w:t>Evidence of Completion</w:t>
-            </w:r>
-          </w:p>
-        </w:tc>
-      </w:tr>
-      <w:tr>
-        <w:tc>
-          <w:tcPr>
-            <w:tcW w:type="dxa" w:w="3360"/>
-            <w:vAlign w:val="center"/>
-          </w:tcPr>
-          <w:p>
-            <w:r>
-              <w:t>Understand</w:t>
-            </w:r>
-          </w:p>
-        </w:tc>
-        <w:tc>
-          <w:tcPr>
-            <w:tcW w:type="dxa" w:w="3360"/>
-            <w:vAlign w:val="center"/>
-          </w:tcPr>
-          <w:p>
-            <w:r>
-              <w:t>What exactly needs to change?</w:t>
-            </w:r>
-          </w:p>
-        </w:tc>
-        <w:tc>
-          <w:tcPr>
-            <w:tcW w:type="dxa" w:w="3360"/>
-            <w:vAlign w:val="center"/>
-          </w:tcPr>
-          <w:p>
-            <w:r>
-              <w:t>Clear requirement</w:t>
-            </w:r>
-          </w:p>
-        </w:tc>
-      </w:tr>
-      <w:tr>
-        <w:tc>
-          <w:tcPr>
-            <w:tcW w:type="dxa" w:w="3360"/>
-            <w:vAlign w:val="center"/>
-          </w:tcPr>
-          <w:p>
-            <w:r>
-              <w:t>Plan</w:t>
-            </w:r>
-          </w:p>
-        </w:tc>
-        <w:tc>
-          <w:tcPr>
-            <w:tcW w:type="dxa" w:w="3360"/>
-            <w:vAlign w:val="center"/>
-          </w:tcPr>
-          <w:p>
-            <w:r>
-              <w:t>How will the change be implemented?</w:t>
-            </w:r>
-          </w:p>
-        </w:tc>
-        <w:tc>
-          <w:tcPr>
-            <w:tcW w:type="dxa" w:w="3360"/>
-            <w:vAlign w:val="center"/>
-          </w:tcPr>
-          <w:p>
-            <w:r>
-              <w:t>Implementation approach</w:t>
-            </w:r>
-          </w:p>
-        </w:tc>
-      </w:tr>
-      <w:tr>
-        <w:tc>
-          <w:tcPr>
-            <w:tcW w:type="dxa" w:w="3360"/>
-            <w:vAlign w:val="center"/>
-          </w:tcPr>
-          <w:p>
-            <w:r>
-              <w:t>Build</w:t>
-            </w:r>
-          </w:p>
-        </w:tc>
-        <w:tc>
-          <w:tcPr>
-            <w:tcW w:type="dxa" w:w="3360"/>
-            <w:vAlign w:val="center"/>
-          </w:tcPr>
-          <w:p>
-            <w:r>
-              <w:t>What work is being performed?</w:t>
-            </w:r>
-          </w:p>
-        </w:tc>
-        <w:tc>
-          <w:tcPr>
-            <w:tcW w:type="dxa" w:w="3360"/>
-            <w:vAlign w:val="center"/>
-          </w:tcPr>
-          <w:p>
-            <w:r>
-              <w:t>Code or configuration</w:t>
-            </w:r>
-          </w:p>
-        </w:tc>
-      </w:tr>
-      <w:tr>
-        <w:tc>
-          <w:tcPr>
-            <w:tcW w:type="dxa" w:w="3360"/>
-            <w:vAlign w:val="center"/>
-          </w:tcPr>
-          <w:p>
-            <w:r>
-              <w:t>Validate</w:t>
-            </w:r>
-          </w:p>
-        </w:tc>
-        <w:tc>
-          <w:tcPr>
-            <w:tcW w:type="dxa" w:w="3360"/>
-            <w:vAlign w:val="center"/>
-          </w:tcPr>
-          <w:p>
-            <w:r>
-              <w:t>Does the result meet expectations?</w:t>
-            </w:r>
-          </w:p>
-        </w:tc>
-        <w:tc>
-          <w:tcPr>
-            <w:tcW w:type="dxa" w:w="3360"/>
-            <w:vAlign w:val="center"/>
-          </w:tcPr>
-          <w:p>
-            <w:r>
-              <w:t>Test results</w:t>
-            </w:r>
-          </w:p>
-        </w:tc>
-      </w:tr>
-      <w:tr>
-        <w:tc>
-          <w:tcPr>
-            <w:tcW w:type="dxa" w:w="3360"/>
-            <w:vAlign w:val="center"/>
-          </w:tcPr>
-          <w:p>
-            <w:r>
-              <w:t>Close</w:t>
-            </w:r>
-          </w:p>
-        </w:tc>
-        <w:tc>
-          <w:tcPr>
-            <w:tcW w:type="dxa" w:w="3360"/>
-            <w:vAlign w:val="center"/>
-          </w:tcPr>
-          <w:p>
-            <w:r>
-              <w:t>Is the work documented and delivered?</w:t>
-            </w:r>
-          </w:p>
-        </w:tc>
-        <w:tc>
-          <w:tcPr>
-            <w:tcW w:type="dxa" w:w="3360"/>
-            <w:vAlign w:val="center"/>
-          </w:tcPr>
-          <w:p>
-            <w:r>
-              <w:t>Completed task</w:t>
-            </w:r>
-          </w:p>
-        </w:tc>
-      </w:tr>
-    </w:tbl>
-    <w:p>
-      <w:pPr>
-        <w:pStyle w:val="Heading1"/>
-      </w:pPr>
-      <w:r>
-        <w:t>7. Communication Checklist</w:t>
-      </w:r>
-    </w:p>
-    <w:p>
-      <w:r>
-        <w:t>Before communicating project status, confirm what was completed, what remains, whether anything is blocked, and whether another person or team needs to take action. Short, factual updates make project coordination easier and reduce ambiguity.</w:t>
-      </w:r>
-    </w:p>
-    <w:p>
-      <w:r>
-        <w:br w:type="page"/>
-      </w:r>
-    </w:p>
-    <w:p>
-      <w:pPr>
-        <w:jc w:val="center"/>
-      </w:pPr>
-      <w:r>
-        <w:rPr>
-          <w:b/>
-          <w:sz w:val="42"/>
-        </w:rPr>
-        <w:t>Quality, Security and Daily Reference</w:t>
-      </w:r>
-    </w:p>
-    <w:p>
-      <w:pPr>
-        <w:pStyle w:val="Heading1"/>
-      </w:pPr>
-      <w:r>
-        <w:t>8. Quality Checklist</w:t>
-      </w:r>
-    </w:p>
-    <w:p>
-      <w:r>
-        <w:t>Quality is not limited to whether software runs successfully. A completed change should also be understandable, tested, maintainable, and consistent with the project's existing conventions.</w:t>
-      </w:r>
-    </w:p>
-    <w:tbl>
-      <w:tblPr>
-        <w:tblStyle w:val="TableGrid"/>
-        <w:tblW w:type="auto" w:w="0"/>
-        <w:jc w:val="center"/>
-        <w:tblLook w:firstColumn="1" w:firstRow="1" w:lastColumn="0" w:lastRow="0" w:noHBand="0" w:noVBand="1" w:val="04A0"/>
-      </w:tblPr>
-      <w:tblGrid>
-        <w:gridCol w:w="3360"/>
-        <w:gridCol w:w="3360"/>
-        <w:gridCol w:w="3360"/>
-      </w:tblGrid>
-      <w:tr>
-        <w:tc>
-          <w:tcPr>
-            <w:tcW w:type="dxa" w:w="3360"/>
-            <w:vAlign w:val="center"/>
-          </w:tcPr>
-          <w:p>
-            <w:r>
-              <w:rPr>
-                <w:b/>
-              </w:rPr>
-              <w:t>Check</w:t>
-            </w:r>
-          </w:p>
-        </w:tc>
-        <w:tc>
-          <w:tcPr>
-            <w:tcW w:type="dxa" w:w="3360"/>
-            <w:vAlign w:val="center"/>
-          </w:tcPr>
-          <w:p>
-            <w:r>
-              <w:rPr>
-                <w:b/>
-              </w:rPr>
-              <w:t>Description</w:t>
-            </w:r>
-          </w:p>
-        </w:tc>
-        <w:tc>
-          <w:tcPr>
-            <w:tcW w:type="dxa" w:w="3360"/>
-            <w:vAlign w:val="center"/>
-          </w:tcPr>
-          <w:p>
-            <w:r>
-              <w:rPr>
-                <w:b/>
-              </w:rPr>
-              <w:t>Status</w:t>
-            </w:r>
-          </w:p>
-        </w:tc>
-      </w:tr>
-      <w:tr>
-        <w:tc>
-          <w:tcPr>
-            <w:tcW w:type="dxa" w:w="3360"/>
-            <w:vAlign w:val="center"/>
-          </w:tcPr>
-          <w:p>
-            <w:r>
-              <w:t>Requirement reviewed</w:t>
-            </w:r>
-          </w:p>
-        </w:tc>
-        <w:tc>
-          <w:tcPr>
-            <w:tcW w:type="dxa" w:w="3360"/>
-            <w:vAlign w:val="center"/>
-          </w:tcPr>
-          <w:p>
-            <w:r>
-              <w:t>The implementation matches the intended requirement.</w:t>
-            </w:r>
-          </w:p>
-        </w:tc>
-        <w:tc>
-          <w:tcPr>
-            <w:tcW w:type="dxa" w:w="3360"/>
-            <w:vAlign w:val="center"/>
-          </w:tcPr>
-          <w:p>
-            <w:r>
-              <w:t>☐</w:t>
-            </w:r>
-          </w:p>
-        </w:tc>
-      </w:tr>
-      <w:tr>
-        <w:tc>
-          <w:tcPr>
-            <w:tcW w:type="dxa" w:w="3360"/>
-            <w:vAlign w:val="center"/>
-          </w:tcPr>
-          <w:p>
-            <w:r>
-              <w:t>Edge cases considered</w:t>
-            </w:r>
-          </w:p>
-        </w:tc>
-        <w:tc>
-          <w:tcPr>
-            <w:tcW w:type="dxa" w:w="3360"/>
-            <w:vAlign w:val="center"/>
-          </w:tcPr>
-          <w:p>
-            <w:r>
-              <w:t>Important unusual inputs or conditions were considered.</w:t>
-            </w:r>
-          </w:p>
-        </w:tc>
-        <w:tc>
-          <w:tcPr>
-            <w:tcW w:type="dxa" w:w="3360"/>
-            <w:vAlign w:val="center"/>
-          </w:tcPr>
-          <w:p>
-            <w:r>
-              <w:t>☐</w:t>
-            </w:r>
-          </w:p>
-        </w:tc>
-      </w:tr>
-      <w:tr>
-        <w:tc>
-          <w:tcPr>
-            <w:tcW w:type="dxa" w:w="3360"/>
-            <w:vAlign w:val="center"/>
-          </w:tcPr>
-          <w:p>
-            <w:r>
-              <w:t>Tests completed</w:t>
-            </w:r>
-          </w:p>
-        </w:tc>
-        <w:tc>
-          <w:tcPr>
-            <w:tcW w:type="dxa" w:w="3360"/>
-            <w:vAlign w:val="center"/>
-          </w:tcPr>
-          <w:p>
-            <w:r>
-              <w:t>Relevant automated or manual tests were performed.</w:t>
-            </w:r>
-          </w:p>
-        </w:tc>
-        <w:tc>
-          <w:tcPr>
-            <w:tcW w:type="dxa" w:w="3360"/>
-            <w:vAlign w:val="center"/>
-          </w:tcPr>
-          <w:p>
-            <w:r>
-              <w:t>☐</w:t>
-            </w:r>
-          </w:p>
-        </w:tc>
-      </w:tr>
-      <w:tr>
-        <w:tc>
-          <w:tcPr>
-            <w:tcW w:type="dxa" w:w="3360"/>
-            <w:vAlign w:val="center"/>
-          </w:tcPr>
-          <w:p>
-            <w:r>
-              <w:t>Error handling reviewed</w:t>
-            </w:r>
-          </w:p>
-        </w:tc>
-        <w:tc>
-          <w:tcPr>
-            <w:tcW w:type="dxa" w:w="3360"/>
-            <w:vAlign w:val="center"/>
-          </w:tcPr>
-          <w:p>
-            <w:r>
-              <w:t>Expected failures are handled appropriately.</w:t>
-            </w:r>
-          </w:p>
-        </w:tc>
-        <w:tc>
-          <w:tcPr>
-            <w:tcW w:type="dxa" w:w="3360"/>
-            <w:vAlign w:val="center"/>
-          </w:tcPr>
-          <w:p>
-            <w:r>
-              <w:t>☐</w:t>
-            </w:r>
-          </w:p>
-        </w:tc>
-      </w:tr>
-      <w:tr>
-        <w:tc>
-          <w:tcPr>
-            <w:tcW w:type="dxa" w:w="3360"/>
-            <w:vAlign w:val="center"/>
-          </w:tcPr>
-          <w:p>
-            <w:r>
-              <w:t>Documentation updated</w:t>
-            </w:r>
-          </w:p>
-        </w:tc>
-        <w:tc>
-          <w:tcPr>
-            <w:tcW w:type="dxa" w:w="3360"/>
-            <w:vAlign w:val="center"/>
-          </w:tcPr>
-          <w:p>
-            <w:r>
-              <w:t>Necessary technical or user documentation is current.</w:t>
-            </w:r>
-          </w:p>
-        </w:tc>
-        <w:tc>
-          <w:tcPr>
-            <w:tcW w:type="dxa" w:w="3360"/>
-            <w:vAlign w:val="center"/>
-          </w:tcPr>
-          <w:p>
-            <w:r>
-              <w:t>☐</w:t>
-            </w:r>
-          </w:p>
-        </w:tc>
-      </w:tr>
-      <w:tr>
-        <w:tc>
-          <w:tcPr>
-            <w:tcW w:type="dxa" w:w="3360"/>
-            <w:vAlign w:val="center"/>
-          </w:tcPr>
-          <w:p>
-            <w:r>
-              <w:t>Peer review completed</w:t>
-            </w:r>
-          </w:p>
-        </w:tc>
-        <w:tc>
-          <w:tcPr>
-            <w:tcW w:type="dxa" w:w="3360"/>
-            <w:vAlign w:val="center"/>
-          </w:tcPr>
-          <w:p>
-            <w:r>
-              <w:t>Another team member has reviewed the change where required.</w:t>
-            </w:r>
-          </w:p>
-        </w:tc>
-        <w:tc>
-          <w:tcPr>
-            <w:tcW w:type="dxa" w:w="3360"/>
-            <w:vAlign w:val="center"/>
-          </w:tcPr>
-          <w:p>
-            <w:r>
-              <w:t>☐</w:t>
-            </w:r>
-          </w:p>
-        </w:tc>
-      </w:tr>
-    </w:tbl>
-    <w:p>
-      <w:pPr>
-        <w:pStyle w:val="Heading1"/>
-      </w:pPr>
-      <w:r>
-        <w:t>9. Information Security Basics</w:t>
-      </w:r>
-    </w:p>
-    <w:p>
-      <w:r>
-        <w:t>Company information should be accessed only through approved systems and only for legitimate work. Passwords, authentication tokens, confidential documents, and private customer information should not be shared through unauthorized channels. When an employee is unsure whether information can be shared, the appropriate security or management process should be followed.</w:t>
-      </w:r>
-    </w:p>
-    <w:p>
-      <w:pPr>
-        <w:pStyle w:val="Heading1"/>
-      </w:pPr>
-      <w:r>
-        <w:t>10. Daily Work Record</w:t>
-      </w:r>
-    </w:p>
-    <w:tbl>
-      <w:tblPr>
-        <w:tblStyle w:val="TableGrid"/>
-        <w:tblW w:type="auto" w:w="0"/>
-        <w:jc w:val="center"/>
-        <w:tblLook w:firstColumn="1" w:firstRow="1" w:lastColumn="0" w:lastRow="0" w:noHBand="0" w:noVBand="1" w:val="04A0"/>
-      </w:tblPr>
-      <w:tblGrid>
-        <w:gridCol w:w="2520"/>
-        <w:gridCol w:w="2520"/>
-        <w:gridCol w:w="2520"/>
-        <w:gridCol w:w="2520"/>
-      </w:tblGrid>
-      <w:tr>
-        <w:tc>
-          <w:tcPr>
-            <w:tcW w:type="dxa" w:w="2520"/>
-            <w:vAlign w:val="center"/>
-          </w:tcPr>
-          <w:p>
-            <w:r>
-              <w:rPr>
-                <w:b/>
-              </w:rPr>
-              <w:t>Date</w:t>
-            </w:r>
-          </w:p>
-        </w:tc>
-        <w:tc>
-          <w:tcPr>
-            <w:tcW w:type="dxa" w:w="2520"/>
-            <w:vAlign w:val="center"/>
-          </w:tcPr>
-          <w:p>
-            <w:r>
-              <w:rPr>
-                <w:b/>
-              </w:rPr>
-              <w:t>Task / Activity</w:t>
-            </w:r>
-          </w:p>
-        </w:tc>
-        <w:tc>
-          <w:tcPr>
-            <w:tcW w:type="dxa" w:w="2520"/>
-            <w:vAlign w:val="center"/>
-          </w:tcPr>
-          <w:p>
-            <w:r>
-              <w:rPr>
-                <w:b/>
-              </w:rPr>
-              <w:t>Result</w:t>
-            </w:r>
-          </w:p>
-        </w:tc>
-        <w:tc>
-          <w:tcPr>
-            <w:tcW w:type="dxa" w:w="2520"/>
-            <w:vAlign w:val="center"/>
-          </w:tcPr>
-          <w:p>
-            <w:r>
-              <w:rPr>
-                <w:b/>
-              </w:rPr>
-              <w:t>Follow-up</w:t>
-            </w:r>
-          </w:p>
-        </w:tc>
-      </w:tr>
-      <w:tr>
-        <w:tc>
-          <w:tcPr>
-            <w:tcW w:type="dxa" w:w="2520"/>
-            <w:vAlign w:val="center"/>
-          </w:tcPr>
-          <w:p>
-            <w:r>
-              <w:t>____________</w:t>
-            </w:r>
-          </w:p>
-        </w:tc>
-        <w:tc>
-          <w:tcPr>
-            <w:tcW w:type="dxa" w:w="2520"/>
-            <w:vAlign w:val="center"/>
-          </w:tcPr>
-          <w:p>
-            <w:r>
-              <w:t>________________________</w:t>
-            </w:r>
-          </w:p>
-        </w:tc>
-        <w:tc>
-          <w:tcPr>
-            <w:tcW w:type="dxa" w:w="2520"/>
-            <w:vAlign w:val="center"/>
-          </w:tcPr>
-          <w:p>
-            <w:r>
-              <w:t>________________</w:t>
-            </w:r>
-          </w:p>
-        </w:tc>
-        <w:tc>
-          <w:tcPr>
-            <w:tcW w:type="dxa" w:w="2520"/>
-            <w:vAlign w:val="center"/>
-          </w:tcPr>
-          <w:p>
-            <w:r>
-              <w:t>________________</w:t>
-            </w:r>
-          </w:p>
-        </w:tc>
-      </w:tr>
-      <w:tr>
-        <w:tc>
-          <w:tcPr>
-            <w:tcW w:type="dxa" w:w="2520"/>
-            <w:vAlign w:val="center"/>
-          </w:tcPr>
-          <w:p>
-            <w:r>
-              <w:t>____________</w:t>
-            </w:r>
-          </w:p>
-        </w:tc>
-        <w:tc>
-          <w:tcPr>
-            <w:tcW w:type="dxa" w:w="2520"/>
-            <w:vAlign w:val="center"/>
-          </w:tcPr>
-          <w:p>
-            <w:r>
-              <w:t>________________________</w:t>
-            </w:r>
-          </w:p>
-        </w:tc>
-        <w:tc>
-          <w:tcPr>
-            <w:tcW w:type="dxa" w:w="2520"/>
-            <w:vAlign w:val="center"/>
-          </w:tcPr>
-          <w:p>
-            <w:r>
-              <w:t>________________</w:t>
-            </w:r>
-          </w:p>
-        </w:tc>
-        <w:tc>
-          <w:tcPr>
-            <w:tcW w:type="dxa" w:w="2520"/>
-            <w:vAlign w:val="center"/>
-          </w:tcPr>
-          <w:p>
-            <w:r>
-              <w:t>________________</w:t>
-            </w:r>
-          </w:p>
-        </w:tc>
-      </w:tr>
-      <w:tr>
-        <w:tc>
-          <w:tcPr>
-            <w:tcW w:type="dxa" w:w="2520"/>
-            <w:vAlign w:val="center"/>
-          </w:tcPr>
-          <w:p>
-            <w:r>
-              <w:t>____________</w:t>
-            </w:r>
-          </w:p>
-        </w:tc>
-        <w:tc>
-          <w:tcPr>
-            <w:tcW w:type="dxa" w:w="2520"/>
-            <w:vAlign w:val="center"/>
-          </w:tcPr>
-          <w:p>
-            <w:r>
-              <w:t>________________________</w:t>
-            </w:r>
-          </w:p>
-        </w:tc>
-        <w:tc>
-          <w:tcPr>
-            <w:tcW w:type="dxa" w:w="2520"/>
-            <w:vAlign w:val="center"/>
-          </w:tcPr>
-          <w:p>
-            <w:r>
-              <w:t>________________</w:t>
-            </w:r>
-          </w:p>
-        </w:tc>
-        <w:tc>
-          <w:tcPr>
-            <w:tcW w:type="dxa" w:w="2520"/>
-            <w:vAlign w:val="center"/>
-          </w:tcPr>
-          <w:p>
-            <w:r>
-              <w:t>________________</w:t>
-            </w:r>
-          </w:p>
-        </w:tc>
-      </w:tr>
-      <w:tr>
-        <w:tc>
-          <w:tcPr>
-            <w:tcW w:type="dxa" w:w="2520"/>
-            <w:vAlign w:val="center"/>
-          </w:tcPr>
-          <w:p>
-            <w:r>
-              <w:t>____________</w:t>
-            </w:r>
-          </w:p>
-        </w:tc>
-        <w:tc>
-          <w:tcPr>
-            <w:tcW w:type="dxa" w:w="2520"/>
-            <w:vAlign w:val="center"/>
-          </w:tcPr>
-          <w:p>
-            <w:r>
-              <w:t>________________________</w:t>
-            </w:r>
-          </w:p>
-        </w:tc>
-        <w:tc>
-          <w:tcPr>
-            <w:tcW w:type="dxa" w:w="2520"/>
-            <w:vAlign w:val="center"/>
-          </w:tcPr>
-          <w:p>
-            <w:r>
-              <w:t>________________</w:t>
-            </w:r>
-          </w:p>
-        </w:tc>
-        <w:tc>
-          <w:tcPr>
-            <w:tcW w:type="dxa" w:w="2520"/>
-            <w:vAlign w:val="center"/>
-          </w:tcPr>
-          <w:p>
-            <w:r>
-              <w:t>________________</w:t>
-            </w:r>
-          </w:p>
-        </w:tc>
-      </w:tr>
-      <w:tr>
-        <w:tc>
-          <w:tcPr>
-            <w:tcW w:type="dxa" w:w="2520"/>
-            <w:vAlign w:val="center"/>
-          </w:tcPr>
-          <w:p>
-            <w:r>
-              <w:t>____________</w:t>
-            </w:r>
-          </w:p>
-        </w:tc>
-        <w:tc>
-          <w:tcPr>
-            <w:tcW w:type="dxa" w:w="2520"/>
-            <w:vAlign w:val="center"/>
-          </w:tcPr>
-          <w:p>
-            <w:r>
-              <w:t>________________________</w:t>
-            </w:r>
-          </w:p>
-        </w:tc>
-        <w:tc>
-          <w:tcPr>
-            <w:tcW w:type="dxa" w:w="2520"/>
-            <w:vAlign w:val="center"/>
-          </w:tcPr>
-          <w:p>
-            <w:r>
-              <w:t>________________</w:t>
-            </w:r>
-          </w:p>
-        </w:tc>
-        <w:tc>
-          <w:tcPr>
-            <w:tcW w:type="dxa" w:w="2520"/>
-            <w:vAlign w:val="center"/>
-          </w:tcPr>
-          <w:p>
-            <w:r>
-              <w:t>________________</w:t>
-            </w:r>
-          </w:p>
-        </w:tc>
-      </w:tr>
-    </w:tbl>
-    <w:p>
-      <w:pPr>
-        <w:pStyle w:val="Heading1"/>
-      </w:pPr>
-      <w:r>
-        <w:t>11. Final Reference Notes</w:t>
-      </w:r>
-    </w:p>
-    <w:p>
-      <w:r>
-        <w:t>Keep important requirements, decisions, assumptions, and outcomes documented. When a process is unclear, identify the specific question and ask the appropriate person. When a task is completed, record enough context that another team member can understand what changed and why.</w:t>
+        <w:drawing>
+          <wp:inline xmlns:a="http://schemas.openxmlformats.org/drawingml/2006/main" xmlns:pic="http://schemas.openxmlformats.org/drawingml/2006/picture">
+            <wp:extent cx="6309360" cy="3830683"/>
+            <wp:docPr id="1" name="Picture 1"/>
+            <wp:cNvGraphicFramePr>
+              <a:graphicFrameLocks noChangeAspect="1"/>
+            </wp:cNvGraphicFramePr>
+            <a:graphic>
+              <a:graphicData uri="http://schemas.openxmlformats.org/drawingml/2006/picture">
+                <pic:pic>
+                  <pic:nvPicPr>
+                    <pic:cNvPr id="0" name="onboarding_checklist.png"/>
+                    <pic:cNvPicPr/>
+                  </pic:nvPicPr>
+                  <pic:blipFill>
+                    <a:blip r:embed="rId9"/>
+                    <a:stretch>
+                      <a:fillRect/>
+                    </a:stretch>
+                  </pic:blipFill>
+                  <pic:spPr>
+                    <a:xfrm>
+                      <a:off x="0" y="0"/>
+                      <a:ext cx="6309360" cy="3830683"/>
+                    </a:xfrm>
+                    <a:prstGeom prst="rect"/>
+                  </pic:spPr>
+                </pic:pic>
+              </a:graphicData>
+            </a:graphic>
+          </wp:inline>
+        </w:drawing>
       </w:r>
     </w:p>
     <w:sectPr>
-      <w:footerReference w:type="default" r:id="rId9"/>
       <w:pgSz w:w="12240" w:h="15840"/>
-      <w:pgMar w:top="1008" w:right="1080" w:bottom="1008" w:left="1080" w:header="720" w:footer="720" w:gutter="0"/>
+      <w:pgMar w:top="936" w:right="1080" w:bottom="936" w:left="1080" w:header="720" w:footer="720" w:gutter="0"/>
       <w:cols w:space="720"/>
       <w:docGrid w:linePitch="360"/>
     </w:sectPr>
   </w:body>
 </w:document>
-</file>
-
-<file path=word/footer1.xml><?xml version="1.0" encoding="utf-8"?>
-<w:ftr xmlns:m="http://schemas.openxmlformats.org/officeDocument/2006/math" xmlns:mc="http://schemas.openxmlformats.org/markup-compatibility/2006" xmlns:mo="http://schemas.microsoft.com/office/mac/office/2008/main" xmlns:mv="urn:schemas-microsoft-com:mac:vml" xmlns:o="urn:schemas-microsoft-com:office:office" xmlns:r="http://schemas.openxmlformats.org/officeDocument/2006/relationships" xmlns:v="urn:schemas-microsoft-com:vml" xmlns:w10="urn:schemas-microsoft-com:office:word" xmlns:w14="http://schemas.microsoft.com/office/word/2010/wordml" xmlns:w="http://schemas.openxmlformats.org/wordprocessingml/2006/main" xmlns:wne="http://schemas.microsoft.com/office/word/2006/wordml" xmlns:wp14="http://schemas.microsoft.com/office/word/2010/wordprocessingDrawing" xmlns:wp="http://schemas.openxmlformats.org/drawingml/2006/wordprocessingDrawing" xmlns:wpc="http://schemas.microsoft.com/office/word/2010/wordprocessingCanvas" xmlns:wpg="http://schemas.microsoft.com/office/word/2010/wordprocessingGroup" xmlns:wpi="http://schemas.microsoft.com/office/word/2010/wordprocessingInk" xmlns:wps="http://schemas.microsoft.com/office/word/2010/wordprocessingShape" mc:Ignorable="w14 wp14">
-  <w:p>
-    <w:pPr>
-      <w:pStyle w:val="Footer"/>
-      <w:jc w:val="center"/>
-    </w:pPr>
-    <w:r>
-      <w:t xml:space="preserve">Employee Reference Document  |  </w:t>
-    </w:r>
-    <w:fldSimple w:instr="PAGE"/>
-  </w:p>
-</w:ftr>
 </file>
 
 <file path=word/numbering.xml><?xml version="1.0" encoding="utf-8"?>
@@ -1848,8 +476,8 @@
     <w:qFormat/>
     <w:rsid w:val="00FC693F"/>
     <w:rPr>
-      <w:rFonts w:ascii="Aptos" w:hAnsi="Aptos"/>
-      <w:sz w:val="21"/>
+      <w:rFonts w:ascii="Arial" w:hAnsi="Arial"/>
+      <w:sz w:val="20"/>
     </w:rPr>
   </w:style>
   <w:style w:type="paragraph" w:styleId="Header">

</xml_diff>